<commit_message>
Actualizacion Bitacora y Uso de IA
</commit_message>
<xml_diff>
--- a/Bitacora/Sprint N.docx
+++ b/Bitacora/Sprint N.docx
@@ -5,6 +5,7 @@
     <w:tbl>
       <w:tblPr>
         <w:tblStyle w:val="Tablaconcuadrcula"/>
+        <w:tblpPr w:leftFromText="141" w:rightFromText="141" w:vertAnchor="page" w:horzAnchor="margin" w:tblpY="4813"/>
         <w:tblW w:w="0" w:type="auto"/>
         <w:tblLook w:val="04A0" w:firstRow="1" w:lastRow="0" w:firstColumn="1" w:lastColumn="0" w:noHBand="0" w:noVBand="1"/>
       </w:tblPr>
@@ -148,10 +149,15 @@
             </w:r>
             <w:proofErr w:type="spellEnd"/>
             <w:r>
-              <w:t xml:space="preserve"> mediante </w:t>
-            </w:r>
-            <w:r>
-              <w:t xml:space="preserve"> </w:t>
+              <w:t xml:space="preserve"> desde el </w:t>
+            </w:r>
+            <w:proofErr w:type="spellStart"/>
+            <w:r>
+              <w:t>frontend</w:t>
+            </w:r>
+            <w:proofErr w:type="spellEnd"/>
+            <w:r>
+              <w:t>.</w:t>
             </w:r>
           </w:p>
         </w:tc>
@@ -266,8 +272,29 @@
           </w:tcPr>
           <w:p>
             <w:r>
-              <w:t xml:space="preserve">Al </w:t>
-            </w:r>
+              <w:t xml:space="preserve">Se utilizó IA como apoyo para revisar la lógica de implementación de la subida de archivos al </w:t>
+            </w:r>
+            <w:proofErr w:type="spellStart"/>
+            <w:r>
+              <w:t>bucket</w:t>
+            </w:r>
+            <w:proofErr w:type="spellEnd"/>
+            <w:r>
+              <w:t xml:space="preserve"> S3 y para depurar errores relacionados con el límite de tamaño. También se consultó para estandarizar variables entre </w:t>
+            </w:r>
+            <w:proofErr w:type="spellStart"/>
+            <w:r>
+              <w:t>frontend</w:t>
+            </w:r>
+            <w:proofErr w:type="spellEnd"/>
+            <w:r>
+              <w:t xml:space="preserve"> y </w:t>
+            </w:r>
+            <w:proofErr w:type="spellStart"/>
+            <w:r>
+              <w:t>backend</w:t>
+            </w:r>
+            <w:proofErr w:type="spellEnd"/>
           </w:p>
         </w:tc>
       </w:tr>
@@ -387,6 +414,77 @@
         </w:tc>
       </w:tr>
     </w:tbl>
+    <w:p>
+      <w:pPr>
+        <w:rPr>
+          <w:sz w:val="60"/>
+          <w:szCs w:val="60"/>
+        </w:rPr>
+      </w:pPr>
+      <w:r>
+        <w:rPr>
+          <w:sz w:val="60"/>
+          <w:szCs w:val="60"/>
+        </w:rPr>
+        <w:t xml:space="preserve">Bitácora con </w:t>
+      </w:r>
+      <w:proofErr w:type="spellStart"/>
+      <w:r>
+        <w:rPr>
+          <w:sz w:val="60"/>
+          <w:szCs w:val="60"/>
+        </w:rPr>
+        <w:t>Sprints</w:t>
+      </w:r>
+      <w:proofErr w:type="spellEnd"/>
+      <w:r>
+        <w:rPr>
+          <w:sz w:val="60"/>
+          <w:szCs w:val="60"/>
+        </w:rPr>
+        <w:t xml:space="preserve"> y </w:t>
+      </w:r>
+      <w:r>
+        <w:rPr>
+          <w:sz w:val="60"/>
+          <w:szCs w:val="60"/>
+        </w:rPr>
+        <w:t>Uso de la IA</w:t>
+      </w:r>
+    </w:p>
+    <w:p/>
+    <w:p/>
+    <w:p/>
+    <w:p>
+      <w:pPr>
+        <w:rPr>
+          <w:sz w:val="36"/>
+          <w:szCs w:val="36"/>
+        </w:rPr>
+      </w:pPr>
+      <w:r>
+        <w:rPr>
+          <w:sz w:val="36"/>
+          <w:szCs w:val="36"/>
+        </w:rPr>
+        <w:t xml:space="preserve">Bitácora con </w:t>
+      </w:r>
+      <w:proofErr w:type="spellStart"/>
+      <w:r>
+        <w:rPr>
+          <w:sz w:val="36"/>
+          <w:szCs w:val="36"/>
+        </w:rPr>
+        <w:t>Sprints</w:t>
+      </w:r>
+      <w:proofErr w:type="spellEnd"/>
+    </w:p>
+    <w:p/>
+    <w:p/>
+    <w:p/>
+    <w:p/>
+    <w:p/>
+    <w:p/>
     <w:p/>
     <w:p>
       <w:r>
@@ -396,12 +494,12 @@
     <w:tbl>
       <w:tblPr>
         <w:tblStyle w:val="Tablaconcuadrcula"/>
-        <w:tblW w:w="0" w:type="auto"/>
+        <w:tblW w:w="9918" w:type="dxa"/>
         <w:tblLook w:val="04A0" w:firstRow="1" w:lastRow="0" w:firstColumn="1" w:lastColumn="0" w:noHBand="0" w:noVBand="1"/>
       </w:tblPr>
       <w:tblGrid>
         <w:gridCol w:w="3114"/>
-        <w:gridCol w:w="5714"/>
+        <w:gridCol w:w="6804"/>
       </w:tblGrid>
       <w:tr>
         <w:tc>
@@ -436,7 +534,7 @@
         </w:tc>
         <w:tc>
           <w:tcPr>
-            <w:tcW w:w="5714" w:type="dxa"/>
+            <w:tcW w:w="6804" w:type="dxa"/>
           </w:tcPr>
           <w:p>
             <w:r>
@@ -468,7 +566,7 @@
         </w:tc>
         <w:tc>
           <w:tcPr>
-            <w:tcW w:w="5714" w:type="dxa"/>
+            <w:tcW w:w="6804" w:type="dxa"/>
           </w:tcPr>
           <w:p>
             <w:r>
@@ -501,7 +599,7 @@
         </w:tc>
         <w:tc>
           <w:tcPr>
-            <w:tcW w:w="5714" w:type="dxa"/>
+            <w:tcW w:w="6804" w:type="dxa"/>
           </w:tcPr>
           <w:p>
             <w:r>
@@ -568,7 +666,7 @@
         </w:tc>
         <w:tc>
           <w:tcPr>
-            <w:tcW w:w="5714" w:type="dxa"/>
+            <w:tcW w:w="6804" w:type="dxa"/>
           </w:tcPr>
           <w:p>
             <w:r>
@@ -625,7 +723,7 @@
         </w:tc>
         <w:tc>
           <w:tcPr>
-            <w:tcW w:w="5714" w:type="dxa"/>
+            <w:tcW w:w="6804" w:type="dxa"/>
           </w:tcPr>
           <w:p>
             <w:r>
@@ -682,7 +780,125 @@
         </w:tc>
         <w:tc>
           <w:tcPr>
-            <w:tcW w:w="5714" w:type="dxa"/>
+            <w:tcW w:w="6804" w:type="dxa"/>
+          </w:tcPr>
+          <w:p>
+            <w:r>
+              <w:t xml:space="preserve">Se utilizó inteligencia artificial como apoyo para la resolución de errores en la integración del sistema, especialmente en la comunicación </w:t>
+            </w:r>
+            <w:r>
+              <w:t>con</w:t>
+            </w:r>
+            <w:r>
+              <w:t xml:space="preserve"> S3. También se empleó para comprender excepciones en Python, corregir problemas de configuración del </w:t>
+            </w:r>
+            <w:proofErr w:type="spellStart"/>
+            <w:r>
+              <w:t>backend</w:t>
+            </w:r>
+            <w:proofErr w:type="spellEnd"/>
+            <w:r>
+              <w:t xml:space="preserve"> y optimizar la lógica de sincronización entre el </w:t>
+            </w:r>
+            <w:proofErr w:type="spellStart"/>
+            <w:r>
+              <w:t>frontend</w:t>
+            </w:r>
+            <w:proofErr w:type="spellEnd"/>
+            <w:r>
+              <w:t xml:space="preserve"> y </w:t>
+            </w:r>
+            <w:r>
+              <w:t xml:space="preserve">el </w:t>
+            </w:r>
+            <w:proofErr w:type="spellStart"/>
+            <w:r>
+              <w:t>bucket</w:t>
+            </w:r>
+            <w:proofErr w:type="spellEnd"/>
+            <w:r>
+              <w:t xml:space="preserve"> s3</w:t>
+            </w:r>
+            <w:r>
+              <w:t xml:space="preserve">. </w:t>
+            </w:r>
+          </w:p>
+        </w:tc>
+      </w:tr>
+      <w:tr>
+        <w:tc>
+          <w:tcPr>
+            <w:tcW w:w="3114" w:type="dxa"/>
+          </w:tcPr>
+          <w:p>
+            <w:pPr>
+              <w:spacing w:after="160" w:line="259" w:lineRule="auto"/>
+              <w:rPr>
+                <w:b/>
+                <w:bCs/>
+              </w:rPr>
+            </w:pPr>
+            <w:r>
+              <w:rPr>
+                <w:b/>
+                <w:bCs/>
+              </w:rPr>
+              <w:t>Próximos pasos: </w:t>
+            </w:r>
+          </w:p>
+          <w:p>
+            <w:pPr>
+              <w:rPr>
+                <w:b/>
+                <w:bCs/>
+              </w:rPr>
+            </w:pPr>
+          </w:p>
+        </w:tc>
+        <w:tc>
+          <w:tcPr>
+            <w:tcW w:w="6804" w:type="dxa"/>
+          </w:tcPr>
+          <w:p>
+            <w:r>
+              <w:t>Implementar la funcionalidad obligatoria de ordenamiento del listado por nombre, tamaño y fecha. Aplicar los controles de seguridad SEC-01 a SEC-10, mejorar la experiencia de usuario y comenzar la documentación del proyecto.</w:t>
+            </w:r>
+          </w:p>
+        </w:tc>
+      </w:tr>
+      <w:tr>
+        <w:tc>
+          <w:tcPr>
+            <w:tcW w:w="3114" w:type="dxa"/>
+          </w:tcPr>
+          <w:p>
+            <w:pPr>
+              <w:spacing w:after="160" w:line="259" w:lineRule="auto"/>
+              <w:rPr>
+                <w:b/>
+                <w:bCs/>
+              </w:rPr>
+            </w:pPr>
+            <w:r>
+              <w:rPr>
+                <w:b/>
+                <w:bCs/>
+              </w:rPr>
+              <w:t>Firmas (ambos integrantes): </w:t>
+            </w:r>
+          </w:p>
+          <w:p>
+            <w:pPr>
+              <w:rPr>
+                <w:b/>
+                <w:bCs/>
+              </w:rPr>
+            </w:pPr>
+          </w:p>
+        </w:tc>
+        <w:tc>
+          <w:tcPr>
+            <w:tcW w:w="6804" w:type="dxa"/>
           </w:tcPr>
           <w:p/>
         </w:tc>
@@ -705,84 +921,6 @@
                 <w:b/>
                 <w:bCs/>
               </w:rPr>
-              <w:t>Próximos pasos: </w:t>
-            </w:r>
-          </w:p>
-          <w:p>
-            <w:pPr>
-              <w:rPr>
-                <w:b/>
-                <w:bCs/>
-              </w:rPr>
-            </w:pPr>
-          </w:p>
-        </w:tc>
-        <w:tc>
-          <w:tcPr>
-            <w:tcW w:w="5714" w:type="dxa"/>
-          </w:tcPr>
-          <w:p>
-            <w:r>
-              <w:t>Implementar la funcionalidad obligatoria de ordenamiento del listado por nombre, tamaño y fecha. Aplicar los controles de seguridad SEC-01 a SEC-10, mejorar la experiencia de usuario y comenzar la documentación del proyecto.</w:t>
-            </w:r>
-          </w:p>
-        </w:tc>
-      </w:tr>
-      <w:tr>
-        <w:tc>
-          <w:tcPr>
-            <w:tcW w:w="3114" w:type="dxa"/>
-          </w:tcPr>
-          <w:p>
-            <w:pPr>
-              <w:spacing w:after="160" w:line="259" w:lineRule="auto"/>
-              <w:rPr>
-                <w:b/>
-                <w:bCs/>
-              </w:rPr>
-            </w:pPr>
-            <w:r>
-              <w:rPr>
-                <w:b/>
-                <w:bCs/>
-              </w:rPr>
-              <w:t>Firmas (ambos integrantes): </w:t>
-            </w:r>
-          </w:p>
-          <w:p>
-            <w:pPr>
-              <w:rPr>
-                <w:b/>
-                <w:bCs/>
-              </w:rPr>
-            </w:pPr>
-          </w:p>
-        </w:tc>
-        <w:tc>
-          <w:tcPr>
-            <w:tcW w:w="5714" w:type="dxa"/>
-          </w:tcPr>
-          <w:p/>
-        </w:tc>
-      </w:tr>
-      <w:tr>
-        <w:tc>
-          <w:tcPr>
-            <w:tcW w:w="3114" w:type="dxa"/>
-          </w:tcPr>
-          <w:p>
-            <w:pPr>
-              <w:spacing w:after="160" w:line="259" w:lineRule="auto"/>
-              <w:rPr>
-                <w:b/>
-                <w:bCs/>
-              </w:rPr>
-            </w:pPr>
-            <w:r>
-              <w:rPr>
-                <w:b/>
-                <w:bCs/>
-              </w:rPr>
               <w:t>Firma docente: </w:t>
             </w:r>
           </w:p>
@@ -797,7 +935,7 @@
         </w:tc>
         <w:tc>
           <w:tcPr>
-            <w:tcW w:w="5714" w:type="dxa"/>
+            <w:tcW w:w="6804" w:type="dxa"/>
           </w:tcPr>
           <w:p/>
         </w:tc>
@@ -808,12 +946,12 @@
     <w:tbl>
       <w:tblPr>
         <w:tblStyle w:val="Tablaconcuadrcula"/>
-        <w:tblW w:w="0" w:type="auto"/>
+        <w:tblW w:w="9918" w:type="dxa"/>
         <w:tblLook w:val="04A0" w:firstRow="1" w:lastRow="0" w:firstColumn="1" w:lastColumn="0" w:noHBand="0" w:noVBand="1"/>
       </w:tblPr>
       <w:tblGrid>
         <w:gridCol w:w="3114"/>
-        <w:gridCol w:w="5714"/>
+        <w:gridCol w:w="6804"/>
       </w:tblGrid>
       <w:tr>
         <w:tc>
@@ -847,9 +985,167 @@
         </w:tc>
         <w:tc>
           <w:tcPr>
-            <w:tcW w:w="5714" w:type="dxa"/>
-          </w:tcPr>
+            <w:tcW w:w="6804" w:type="dxa"/>
+          </w:tcPr>
+          <w:p>
+            <w:r>
+              <w:t>3</w:t>
+            </w:r>
+          </w:p>
+        </w:tc>
+      </w:tr>
+      <w:tr>
+        <w:tc>
+          <w:tcPr>
+            <w:tcW w:w="3114" w:type="dxa"/>
+          </w:tcPr>
+          <w:p>
+            <w:pPr>
+              <w:rPr>
+                <w:b/>
+                <w:bCs/>
+              </w:rPr>
+            </w:pPr>
+            <w:r>
+              <w:rPr>
+                <w:b/>
+                <w:bCs/>
+              </w:rPr>
+              <w:t>Fecha</w:t>
+            </w:r>
+          </w:p>
+        </w:tc>
+        <w:tc>
+          <w:tcPr>
+            <w:tcW w:w="6804" w:type="dxa"/>
+          </w:tcPr>
+          <w:p>
+            <w:r>
+              <w:t>25/06/2026</w:t>
+            </w:r>
+          </w:p>
+        </w:tc>
+      </w:tr>
+      <w:tr>
+        <w:tc>
+          <w:tcPr>
+            <w:tcW w:w="3114" w:type="dxa"/>
+          </w:tcPr>
+          <w:p>
+            <w:pPr>
+              <w:spacing w:after="160" w:line="259" w:lineRule="auto"/>
+              <w:rPr>
+                <w:b/>
+                <w:bCs/>
+              </w:rPr>
+            </w:pPr>
+            <w:r>
+              <w:rPr>
+                <w:b/>
+                <w:bCs/>
+              </w:rPr>
+              <w:t>Lo que hicimos esta semana (4-6 líneas): </w:t>
+            </w:r>
+          </w:p>
+        </w:tc>
+        <w:tc>
+          <w:tcPr>
+            <w:tcW w:w="6804" w:type="dxa"/>
+          </w:tcPr>
+          <w:p>
+            <w:r>
+              <w:t xml:space="preserve">Se mejoró el diseño del </w:t>
+            </w:r>
+            <w:proofErr w:type="spellStart"/>
+            <w:r>
+              <w:t>frontend</w:t>
+            </w:r>
+            <w:proofErr w:type="spellEnd"/>
+            <w:r>
+              <w:t xml:space="preserve"> para hacerlo más limpio y funcional, y se implementaron las medidas de seguridad solicitadas según las reglas del Anexo B (SEC-01 a SEC-10). Además, se integraron configuraciones de </w:t>
+            </w:r>
+            <w:proofErr w:type="spellStart"/>
+            <w:r>
+              <w:t>backend</w:t>
+            </w:r>
+            <w:proofErr w:type="spellEnd"/>
+            <w:r>
+              <w:t xml:space="preserve"> para reforzar la validación de archivos, control de acceso y comunicación segura entre servicios. También se realizaron pruebas generales para verificar el correcto funcionamiento del sistema en entorno local y de despliegue.</w:t>
+            </w:r>
+          </w:p>
+        </w:tc>
+      </w:tr>
+      <w:tr>
+        <w:tc>
+          <w:tcPr>
+            <w:tcW w:w="3114" w:type="dxa"/>
+          </w:tcPr>
+          <w:p>
+            <w:pPr>
+              <w:spacing w:after="160" w:line="259" w:lineRule="auto"/>
+              <w:rPr>
+                <w:b/>
+                <w:bCs/>
+              </w:rPr>
+            </w:pPr>
+            <w:r>
+              <w:rPr>
+                <w:b/>
+                <w:bCs/>
+              </w:rPr>
+              <w:t>Problemas encontrados: </w:t>
+            </w:r>
+          </w:p>
+        </w:tc>
+        <w:tc>
+          <w:tcPr>
+            <w:tcW w:w="6804" w:type="dxa"/>
+          </w:tcPr>
+          <w:p>
+            <w:r>
+              <w:t xml:space="preserve">Problemas al restringir correctamente los orígenes permitidos, especialmente al pasar de entorno local a producción. En algunos casos el </w:t>
+            </w:r>
+            <w:proofErr w:type="spellStart"/>
+            <w:r>
+              <w:t>frontend</w:t>
+            </w:r>
+            <w:proofErr w:type="spellEnd"/>
+            <w:r>
+              <w:t xml:space="preserve"> no lograba comunicarse con el </w:t>
+            </w:r>
+            <w:proofErr w:type="spellStart"/>
+            <w:r>
+              <w:t>backend</w:t>
+            </w:r>
+            <w:proofErr w:type="spellEnd"/>
+            <w:r>
+              <w:t xml:space="preserve"> por configuraciones demasiado estrictas o mal definidas.</w:t>
+            </w:r>
+          </w:p>
           <w:p/>
+          <w:p>
+            <w:r>
+              <w:lastRenderedPageBreak/>
+              <w:t xml:space="preserve">Dificultad al aplicar correctamente las reglas de CORS, ya que pequeños errores en la configuración provocaban bloqueos de comunicación entre </w:t>
+            </w:r>
+            <w:proofErr w:type="spellStart"/>
+            <w:r>
+              <w:t>frontend</w:t>
+            </w:r>
+            <w:proofErr w:type="spellEnd"/>
+            <w:r>
+              <w:t xml:space="preserve"> y </w:t>
+            </w:r>
+            <w:proofErr w:type="spellStart"/>
+            <w:r>
+              <w:t>backend</w:t>
+            </w:r>
+            <w:proofErr w:type="spellEnd"/>
+            <w:r>
+              <w:t>, afectando las pruebas de integración.</w:t>
+            </w:r>
+          </w:p>
+          <w:p/>
         </w:tc>
       </w:tr>
       <w:tr>
@@ -859,23 +1155,215 @@
           </w:tcPr>
           <w:p>
             <w:pPr>
-              <w:rPr>
-                <w:b/>
-                <w:bCs/>
-              </w:rPr>
-            </w:pPr>
-            <w:r>
-              <w:rPr>
-                <w:b/>
-                <w:bCs/>
-              </w:rPr>
-              <w:t>Fecha</w:t>
-            </w:r>
-          </w:p>
-        </w:tc>
-        <w:tc>
-          <w:tcPr>
-            <w:tcW w:w="5714" w:type="dxa"/>
+              <w:spacing w:after="160" w:line="259" w:lineRule="auto"/>
+              <w:rPr>
+                <w:b/>
+                <w:bCs/>
+              </w:rPr>
+            </w:pPr>
+            <w:r>
+              <w:rPr>
+                <w:b/>
+                <w:bCs/>
+              </w:rPr>
+              <w:lastRenderedPageBreak/>
+              <w:t>Cómo los resolvimos: </w:t>
+            </w:r>
+          </w:p>
+          <w:p>
+            <w:pPr>
+              <w:rPr>
+                <w:b/>
+                <w:bCs/>
+              </w:rPr>
+            </w:pPr>
+          </w:p>
+        </w:tc>
+        <w:tc>
+          <w:tcPr>
+            <w:tcW w:w="6804" w:type="dxa"/>
+          </w:tcPr>
+          <w:p>
+            <w:r>
+              <w:t xml:space="preserve">Se ajustaron las configuraciones de CORS paso a paso, validando primero en entorno local y luego en producción hasta lograr comunicación estable. Se revisaron los orígenes permitidos y se corrigieron inconsistencias entre </w:t>
+            </w:r>
+            <w:proofErr w:type="spellStart"/>
+            <w:r>
+              <w:t>URLs</w:t>
+            </w:r>
+            <w:proofErr w:type="spellEnd"/>
+            <w:r>
+              <w:t xml:space="preserve"> del </w:t>
+            </w:r>
+            <w:proofErr w:type="spellStart"/>
+            <w:r>
+              <w:t>frontend</w:t>
+            </w:r>
+            <w:proofErr w:type="spellEnd"/>
+            <w:r>
+              <w:t xml:space="preserve"> y </w:t>
+            </w:r>
+            <w:proofErr w:type="spellStart"/>
+            <w:r>
+              <w:t>backend</w:t>
+            </w:r>
+            <w:proofErr w:type="spellEnd"/>
+            <w:r>
+              <w:t>.</w:t>
+            </w:r>
+          </w:p>
+        </w:tc>
+      </w:tr>
+      <w:tr>
+        <w:tc>
+          <w:tcPr>
+            <w:tcW w:w="3114" w:type="dxa"/>
+          </w:tcPr>
+          <w:p>
+            <w:pPr>
+              <w:spacing w:after="160" w:line="259" w:lineRule="auto"/>
+              <w:rPr>
+                <w:b/>
+                <w:bCs/>
+              </w:rPr>
+            </w:pPr>
+            <w:r>
+              <w:rPr>
+                <w:b/>
+                <w:bCs/>
+              </w:rPr>
+              <w:t>Usos de IA esta semana: </w:t>
+            </w:r>
+          </w:p>
+          <w:p>
+            <w:pPr>
+              <w:rPr>
+                <w:b/>
+                <w:bCs/>
+              </w:rPr>
+            </w:pPr>
+          </w:p>
+        </w:tc>
+        <w:tc>
+          <w:tcPr>
+            <w:tcW w:w="6804" w:type="dxa"/>
+          </w:tcPr>
+          <w:p>
+            <w:r>
+              <w:t xml:space="preserve">Se utilizó IA como apoyo para comprender la configuración correcta de CORS en </w:t>
+            </w:r>
+            <w:proofErr w:type="spellStart"/>
+            <w:r>
+              <w:t>FastAPI</w:t>
+            </w:r>
+            <w:proofErr w:type="spellEnd"/>
+            <w:r>
+              <w:t xml:space="preserve"> y su comportamiento en distintos entornos. También se consultó para identificar errores comunes en la comunicación entre </w:t>
+            </w:r>
+            <w:proofErr w:type="spellStart"/>
+            <w:r>
+              <w:t>frontend</w:t>
+            </w:r>
+            <w:proofErr w:type="spellEnd"/>
+            <w:r>
+              <w:t xml:space="preserve"> y </w:t>
+            </w:r>
+            <w:proofErr w:type="spellStart"/>
+            <w:r>
+              <w:t>backend</w:t>
+            </w:r>
+            <w:proofErr w:type="spellEnd"/>
+            <w:r>
+              <w:t xml:space="preserve"> relacionados con políticas de origen cruzado.</w:t>
+            </w:r>
+          </w:p>
+        </w:tc>
+      </w:tr>
+      <w:tr>
+        <w:tc>
+          <w:tcPr>
+            <w:tcW w:w="3114" w:type="dxa"/>
+          </w:tcPr>
+          <w:p>
+            <w:pPr>
+              <w:spacing w:after="160" w:line="259" w:lineRule="auto"/>
+              <w:rPr>
+                <w:b/>
+                <w:bCs/>
+              </w:rPr>
+            </w:pPr>
+            <w:r>
+              <w:rPr>
+                <w:b/>
+                <w:bCs/>
+              </w:rPr>
+              <w:t>Próximos pasos: </w:t>
+            </w:r>
+          </w:p>
+          <w:p>
+            <w:pPr>
+              <w:rPr>
+                <w:b/>
+                <w:bCs/>
+              </w:rPr>
+            </w:pPr>
+          </w:p>
+        </w:tc>
+        <w:tc>
+          <w:tcPr>
+            <w:tcW w:w="6804" w:type="dxa"/>
+          </w:tcPr>
+          <w:p>
+            <w:r>
+              <w:t xml:space="preserve">Implementar la base de datos </w:t>
+            </w:r>
+            <w:proofErr w:type="spellStart"/>
+            <w:r>
+              <w:t>dynamodb</w:t>
+            </w:r>
+            <w:proofErr w:type="spellEnd"/>
+            <w:r>
+              <w:t xml:space="preserve">, haciendo una conexión directa </w:t>
+            </w:r>
+            <w:r>
+              <w:t>mediante boto3</w:t>
+            </w:r>
+          </w:p>
+        </w:tc>
+      </w:tr>
+      <w:tr>
+        <w:tc>
+          <w:tcPr>
+            <w:tcW w:w="3114" w:type="dxa"/>
+          </w:tcPr>
+          <w:p>
+            <w:pPr>
+              <w:spacing w:after="160" w:line="259" w:lineRule="auto"/>
+              <w:rPr>
+                <w:b/>
+                <w:bCs/>
+              </w:rPr>
+            </w:pPr>
+            <w:r>
+              <w:rPr>
+                <w:b/>
+                <w:bCs/>
+              </w:rPr>
+              <w:t>Firmas (ambos integrantes): </w:t>
+            </w:r>
+          </w:p>
+          <w:p>
+            <w:pPr>
+              <w:rPr>
+                <w:b/>
+                <w:bCs/>
+              </w:rPr>
+            </w:pPr>
+          </w:p>
+        </w:tc>
+        <w:tc>
+          <w:tcPr>
+            <w:tcW w:w="6804" w:type="dxa"/>
           </w:tcPr>
           <w:p/>
         </w:tc>
@@ -898,213 +1386,6 @@
                 <w:b/>
                 <w:bCs/>
               </w:rPr>
-              <w:t>Lo que hicimos esta semana (4-6 líneas): </w:t>
-            </w:r>
-          </w:p>
-        </w:tc>
-        <w:tc>
-          <w:tcPr>
-            <w:tcW w:w="5714" w:type="dxa"/>
-          </w:tcPr>
-          <w:p/>
-        </w:tc>
-      </w:tr>
-      <w:tr>
-        <w:tc>
-          <w:tcPr>
-            <w:tcW w:w="3114" w:type="dxa"/>
-          </w:tcPr>
-          <w:p>
-            <w:pPr>
-              <w:spacing w:after="160" w:line="259" w:lineRule="auto"/>
-              <w:rPr>
-                <w:b/>
-                <w:bCs/>
-              </w:rPr>
-            </w:pPr>
-            <w:r>
-              <w:rPr>
-                <w:b/>
-                <w:bCs/>
-              </w:rPr>
-              <w:t>Problemas encontrados: </w:t>
-            </w:r>
-          </w:p>
-        </w:tc>
-        <w:tc>
-          <w:tcPr>
-            <w:tcW w:w="5714" w:type="dxa"/>
-          </w:tcPr>
-          <w:p/>
-        </w:tc>
-      </w:tr>
-      <w:tr>
-        <w:tc>
-          <w:tcPr>
-            <w:tcW w:w="3114" w:type="dxa"/>
-          </w:tcPr>
-          <w:p>
-            <w:pPr>
-              <w:spacing w:after="160" w:line="259" w:lineRule="auto"/>
-              <w:rPr>
-                <w:b/>
-                <w:bCs/>
-              </w:rPr>
-            </w:pPr>
-            <w:r>
-              <w:rPr>
-                <w:b/>
-                <w:bCs/>
-              </w:rPr>
-              <w:t>Cómo los resolvimos: </w:t>
-            </w:r>
-          </w:p>
-          <w:p>
-            <w:pPr>
-              <w:rPr>
-                <w:b/>
-                <w:bCs/>
-              </w:rPr>
-            </w:pPr>
-          </w:p>
-        </w:tc>
-        <w:tc>
-          <w:tcPr>
-            <w:tcW w:w="5714" w:type="dxa"/>
-          </w:tcPr>
-          <w:p/>
-        </w:tc>
-      </w:tr>
-      <w:tr>
-        <w:tc>
-          <w:tcPr>
-            <w:tcW w:w="3114" w:type="dxa"/>
-          </w:tcPr>
-          <w:p>
-            <w:pPr>
-              <w:spacing w:after="160" w:line="259" w:lineRule="auto"/>
-              <w:rPr>
-                <w:b/>
-                <w:bCs/>
-              </w:rPr>
-            </w:pPr>
-            <w:r>
-              <w:rPr>
-                <w:b/>
-                <w:bCs/>
-              </w:rPr>
-              <w:t>Usos de IA esta semana: </w:t>
-            </w:r>
-          </w:p>
-          <w:p>
-            <w:pPr>
-              <w:rPr>
-                <w:b/>
-                <w:bCs/>
-              </w:rPr>
-            </w:pPr>
-          </w:p>
-        </w:tc>
-        <w:tc>
-          <w:tcPr>
-            <w:tcW w:w="5714" w:type="dxa"/>
-          </w:tcPr>
-          <w:p/>
-        </w:tc>
-      </w:tr>
-      <w:tr>
-        <w:tc>
-          <w:tcPr>
-            <w:tcW w:w="3114" w:type="dxa"/>
-          </w:tcPr>
-          <w:p>
-            <w:pPr>
-              <w:spacing w:after="160" w:line="259" w:lineRule="auto"/>
-              <w:rPr>
-                <w:b/>
-                <w:bCs/>
-              </w:rPr>
-            </w:pPr>
-            <w:r>
-              <w:rPr>
-                <w:b/>
-                <w:bCs/>
-              </w:rPr>
-              <w:t>Próximos pasos: </w:t>
-            </w:r>
-          </w:p>
-          <w:p>
-            <w:pPr>
-              <w:rPr>
-                <w:b/>
-                <w:bCs/>
-              </w:rPr>
-            </w:pPr>
-          </w:p>
-        </w:tc>
-        <w:tc>
-          <w:tcPr>
-            <w:tcW w:w="5714" w:type="dxa"/>
-          </w:tcPr>
-          <w:p/>
-        </w:tc>
-      </w:tr>
-      <w:tr>
-        <w:tc>
-          <w:tcPr>
-            <w:tcW w:w="3114" w:type="dxa"/>
-          </w:tcPr>
-          <w:p>
-            <w:pPr>
-              <w:spacing w:after="160" w:line="259" w:lineRule="auto"/>
-              <w:rPr>
-                <w:b/>
-                <w:bCs/>
-              </w:rPr>
-            </w:pPr>
-            <w:r>
-              <w:rPr>
-                <w:b/>
-                <w:bCs/>
-              </w:rPr>
-              <w:lastRenderedPageBreak/>
-              <w:t>Firmas (ambos integrantes): </w:t>
-            </w:r>
-          </w:p>
-          <w:p>
-            <w:pPr>
-              <w:rPr>
-                <w:b/>
-                <w:bCs/>
-              </w:rPr>
-            </w:pPr>
-          </w:p>
-        </w:tc>
-        <w:tc>
-          <w:tcPr>
-            <w:tcW w:w="5714" w:type="dxa"/>
-          </w:tcPr>
-          <w:p/>
-        </w:tc>
-      </w:tr>
-      <w:tr>
-        <w:tc>
-          <w:tcPr>
-            <w:tcW w:w="3114" w:type="dxa"/>
-          </w:tcPr>
-          <w:p>
-            <w:pPr>
-              <w:spacing w:after="160" w:line="259" w:lineRule="auto"/>
-              <w:rPr>
-                <w:b/>
-                <w:bCs/>
-              </w:rPr>
-            </w:pPr>
-            <w:r>
-              <w:rPr>
-                <w:b/>
-                <w:bCs/>
-              </w:rPr>
               <w:t>Firma docente: </w:t>
             </w:r>
           </w:p>
@@ -1119,7 +1400,7 @@
         </w:tc>
         <w:tc>
           <w:tcPr>
-            <w:tcW w:w="5714" w:type="dxa"/>
+            <w:tcW w:w="6804" w:type="dxa"/>
           </w:tcPr>
           <w:p/>
         </w:tc>
@@ -1131,12 +1412,12 @@
     <w:tbl>
       <w:tblPr>
         <w:tblStyle w:val="Tablaconcuadrcula"/>
-        <w:tblW w:w="0" w:type="auto"/>
+        <w:tblW w:w="10343" w:type="dxa"/>
         <w:tblLook w:val="04A0" w:firstRow="1" w:lastRow="0" w:firstColumn="1" w:lastColumn="0" w:noHBand="0" w:noVBand="1"/>
       </w:tblPr>
       <w:tblGrid>
         <w:gridCol w:w="3114"/>
-        <w:gridCol w:w="5714"/>
+        <w:gridCol w:w="7229"/>
       </w:tblGrid>
       <w:tr>
         <w:tc>
@@ -1170,7 +1451,364 @@
         </w:tc>
         <w:tc>
           <w:tcPr>
-            <w:tcW w:w="5714" w:type="dxa"/>
+            <w:tcW w:w="7229" w:type="dxa"/>
+          </w:tcPr>
+          <w:p>
+            <w:r>
+              <w:t>4</w:t>
+            </w:r>
+          </w:p>
+        </w:tc>
+      </w:tr>
+      <w:tr>
+        <w:tc>
+          <w:tcPr>
+            <w:tcW w:w="3114" w:type="dxa"/>
+          </w:tcPr>
+          <w:p>
+            <w:pPr>
+              <w:rPr>
+                <w:b/>
+                <w:bCs/>
+              </w:rPr>
+            </w:pPr>
+            <w:r>
+              <w:rPr>
+                <w:b/>
+                <w:bCs/>
+              </w:rPr>
+              <w:t>Fecha</w:t>
+            </w:r>
+          </w:p>
+        </w:tc>
+        <w:tc>
+          <w:tcPr>
+            <w:tcW w:w="7229" w:type="dxa"/>
+          </w:tcPr>
+          <w:p>
+            <w:r>
+              <w:t>02/07/2026</w:t>
+            </w:r>
+          </w:p>
+        </w:tc>
+      </w:tr>
+      <w:tr>
+        <w:tc>
+          <w:tcPr>
+            <w:tcW w:w="3114" w:type="dxa"/>
+          </w:tcPr>
+          <w:p>
+            <w:pPr>
+              <w:spacing w:after="160" w:line="259" w:lineRule="auto"/>
+              <w:rPr>
+                <w:b/>
+                <w:bCs/>
+              </w:rPr>
+            </w:pPr>
+            <w:r>
+              <w:rPr>
+                <w:b/>
+                <w:bCs/>
+              </w:rPr>
+              <w:t>Lo que hicimos esta semana (4-6 líneas): </w:t>
+            </w:r>
+          </w:p>
+        </w:tc>
+        <w:tc>
+          <w:tcPr>
+            <w:tcW w:w="7229" w:type="dxa"/>
+          </w:tcPr>
+          <w:p>
+            <w:r>
+              <w:t xml:space="preserve">Se integró el servicio de Amazon </w:t>
+            </w:r>
+            <w:proofErr w:type="spellStart"/>
+            <w:r>
+              <w:t>DynamoDB</w:t>
+            </w:r>
+            <w:proofErr w:type="spellEnd"/>
+            <w:r>
+              <w:t xml:space="preserve"> al </w:t>
+            </w:r>
+            <w:proofErr w:type="spellStart"/>
+            <w:r>
+              <w:t>backend</w:t>
+            </w:r>
+            <w:proofErr w:type="spellEnd"/>
+            <w:r>
+              <w:t xml:space="preserve"> desarrollado con </w:t>
+            </w:r>
+            <w:proofErr w:type="spellStart"/>
+            <w:r>
+              <w:t>FastAPI</w:t>
+            </w:r>
+            <w:proofErr w:type="spellEnd"/>
+            <w:r>
+              <w:t xml:space="preserve">, creando la conexión mediante boto3 y variables de entorno. Se implementó la lógica para registrar automáticamente la información de los archivos subidos al </w:t>
+            </w:r>
+            <w:proofErr w:type="spellStart"/>
+            <w:r>
+              <w:t>bucket</w:t>
+            </w:r>
+            <w:proofErr w:type="spellEnd"/>
+            <w:r>
+              <w:t xml:space="preserve"> S3 en una tabla de </w:t>
+            </w:r>
+            <w:proofErr w:type="spellStart"/>
+            <w:r>
+              <w:t>DynamoDB</w:t>
+            </w:r>
+            <w:proofErr w:type="spellEnd"/>
+            <w:r>
+              <w:t xml:space="preserve">. Además, se realizaron pruebas de integración entre el </w:t>
+            </w:r>
+            <w:proofErr w:type="spellStart"/>
+            <w:r>
+              <w:t>frontend</w:t>
+            </w:r>
+            <w:proofErr w:type="spellEnd"/>
+            <w:r>
+              <w:t xml:space="preserve">, el </w:t>
+            </w:r>
+            <w:proofErr w:type="spellStart"/>
+            <w:r>
+              <w:t>backend</w:t>
+            </w:r>
+            <w:proofErr w:type="spellEnd"/>
+            <w:r>
+              <w:t xml:space="preserve">, S3 y </w:t>
+            </w:r>
+            <w:proofErr w:type="spellStart"/>
+            <w:r>
+              <w:t>DynamoDB</w:t>
+            </w:r>
+            <w:proofErr w:type="spellEnd"/>
+            <w:r>
+              <w:t>, identificando y corrigiendo problemas relacionados con la configuración de rutas, credenciales e identificación de registros durante las operaciones de carga y eliminación de archivos.</w:t>
+            </w:r>
+          </w:p>
+        </w:tc>
+      </w:tr>
+      <w:tr>
+        <w:tc>
+          <w:tcPr>
+            <w:tcW w:w="3114" w:type="dxa"/>
+          </w:tcPr>
+          <w:p>
+            <w:pPr>
+              <w:spacing w:after="160" w:line="259" w:lineRule="auto"/>
+              <w:rPr>
+                <w:b/>
+                <w:bCs/>
+              </w:rPr>
+            </w:pPr>
+            <w:r>
+              <w:rPr>
+                <w:b/>
+                <w:bCs/>
+              </w:rPr>
+              <w:t>Problemas encontrados: </w:t>
+            </w:r>
+          </w:p>
+        </w:tc>
+        <w:tc>
+          <w:tcPr>
+            <w:tcW w:w="7229" w:type="dxa"/>
+          </w:tcPr>
+          <w:p>
+            <w:r>
+              <w:t xml:space="preserve">Dificultades al integrar </w:t>
+            </w:r>
+            <w:proofErr w:type="spellStart"/>
+            <w:r>
+              <w:t>DynamoDB</w:t>
+            </w:r>
+            <w:proofErr w:type="spellEnd"/>
+            <w:r>
+              <w:t xml:space="preserve"> con el </w:t>
+            </w:r>
+            <w:proofErr w:type="spellStart"/>
+            <w:r>
+              <w:t>backend</w:t>
+            </w:r>
+            <w:proofErr w:type="spellEnd"/>
+            <w:r>
+              <w:t xml:space="preserve">, errores de importación de módulos, configuración de credenciales y problemas de sincronización entre S3 y </w:t>
+            </w:r>
+            <w:proofErr w:type="spellStart"/>
+            <w:r>
+              <w:t>DynamoDB</w:t>
+            </w:r>
+            <w:proofErr w:type="spellEnd"/>
+            <w:r>
+              <w:t xml:space="preserve"> al eliminar archivos.</w:t>
+            </w:r>
+          </w:p>
+        </w:tc>
+      </w:tr>
+      <w:tr>
+        <w:tc>
+          <w:tcPr>
+            <w:tcW w:w="3114" w:type="dxa"/>
+          </w:tcPr>
+          <w:p>
+            <w:pPr>
+              <w:spacing w:after="160" w:line="259" w:lineRule="auto"/>
+              <w:rPr>
+                <w:b/>
+                <w:bCs/>
+              </w:rPr>
+            </w:pPr>
+            <w:r>
+              <w:rPr>
+                <w:b/>
+                <w:bCs/>
+              </w:rPr>
+              <w:t>Cómo los resolvimos: </w:t>
+            </w:r>
+          </w:p>
+          <w:p>
+            <w:pPr>
+              <w:rPr>
+                <w:b/>
+                <w:bCs/>
+              </w:rPr>
+            </w:pPr>
+          </w:p>
+        </w:tc>
+        <w:tc>
+          <w:tcPr>
+            <w:tcW w:w="7229" w:type="dxa"/>
+          </w:tcPr>
+          <w:p>
+            <w:r>
+              <w:t xml:space="preserve">Se corrigieron los </w:t>
+            </w:r>
+            <w:proofErr w:type="spellStart"/>
+            <w:r>
+              <w:t>imports</w:t>
+            </w:r>
+            <w:proofErr w:type="spellEnd"/>
+            <w:r>
+              <w:t xml:space="preserve"> y la configuración del proyecto, se verificó la conexión con AWS mediante variables de entorno y se ajustó la lógica de integración y pruebas entre el </w:t>
+            </w:r>
+            <w:proofErr w:type="spellStart"/>
+            <w:r>
+              <w:t>frontend</w:t>
+            </w:r>
+            <w:proofErr w:type="spellEnd"/>
+            <w:r>
+              <w:t xml:space="preserve">, </w:t>
+            </w:r>
+            <w:proofErr w:type="spellStart"/>
+            <w:r>
+              <w:t>FastAPI</w:t>
+            </w:r>
+            <w:proofErr w:type="spellEnd"/>
+            <w:r>
+              <w:t xml:space="preserve">, S3 y </w:t>
+            </w:r>
+            <w:proofErr w:type="spellStart"/>
+            <w:r>
+              <w:t>DynamoDB</w:t>
+            </w:r>
+            <w:proofErr w:type="spellEnd"/>
+            <w:r>
+              <w:t>.</w:t>
+            </w:r>
+          </w:p>
+        </w:tc>
+      </w:tr>
+      <w:tr>
+        <w:tc>
+          <w:tcPr>
+            <w:tcW w:w="3114" w:type="dxa"/>
+          </w:tcPr>
+          <w:p>
+            <w:pPr>
+              <w:spacing w:after="160" w:line="259" w:lineRule="auto"/>
+              <w:rPr>
+                <w:b/>
+                <w:bCs/>
+              </w:rPr>
+            </w:pPr>
+            <w:r>
+              <w:rPr>
+                <w:b/>
+                <w:bCs/>
+              </w:rPr>
+              <w:t>Usos de IA esta semana: </w:t>
+            </w:r>
+          </w:p>
+          <w:p>
+            <w:pPr>
+              <w:rPr>
+                <w:b/>
+                <w:bCs/>
+              </w:rPr>
+            </w:pPr>
+          </w:p>
+        </w:tc>
+        <w:tc>
+          <w:tcPr>
+            <w:tcW w:w="7229" w:type="dxa"/>
+          </w:tcPr>
+          <w:p>
+            <w:r>
+              <w:t xml:space="preserve">Se utilizó IA para apoyar la resolución de errores, explicar excepciones del </w:t>
+            </w:r>
+            <w:proofErr w:type="spellStart"/>
+            <w:r>
+              <w:t>backend</w:t>
+            </w:r>
+            <w:proofErr w:type="spellEnd"/>
+            <w:r>
+              <w:t xml:space="preserve">, orientar la integración con </w:t>
+            </w:r>
+            <w:proofErr w:type="spellStart"/>
+            <w:r>
+              <w:t>DynamoDB</w:t>
+            </w:r>
+            <w:proofErr w:type="spellEnd"/>
+            <w:r>
+              <w:t xml:space="preserve"> y proponer mejoras en la arquitectura del proyecto.</w:t>
+            </w:r>
+          </w:p>
+        </w:tc>
+      </w:tr>
+      <w:tr>
+        <w:tc>
+          <w:tcPr>
+            <w:tcW w:w="3114" w:type="dxa"/>
+          </w:tcPr>
+          <w:p>
+            <w:pPr>
+              <w:spacing w:after="160" w:line="259" w:lineRule="auto"/>
+              <w:rPr>
+                <w:b/>
+                <w:bCs/>
+              </w:rPr>
+            </w:pPr>
+            <w:r>
+              <w:rPr>
+                <w:b/>
+                <w:bCs/>
+              </w:rPr>
+              <w:t>Próximos pasos: </w:t>
+            </w:r>
+          </w:p>
+          <w:p>
+            <w:pPr>
+              <w:rPr>
+                <w:b/>
+                <w:bCs/>
+              </w:rPr>
+            </w:pPr>
+          </w:p>
+        </w:tc>
+        <w:tc>
+          <w:tcPr>
+            <w:tcW w:w="7229" w:type="dxa"/>
           </w:tcPr>
           <w:p/>
         </w:tc>
@@ -1182,23 +1820,32 @@
           </w:tcPr>
           <w:p>
             <w:pPr>
-              <w:rPr>
-                <w:b/>
-                <w:bCs/>
-              </w:rPr>
-            </w:pPr>
-            <w:r>
-              <w:rPr>
-                <w:b/>
-                <w:bCs/>
-              </w:rPr>
-              <w:t>Fecha</w:t>
-            </w:r>
-          </w:p>
-        </w:tc>
-        <w:tc>
-          <w:tcPr>
-            <w:tcW w:w="5714" w:type="dxa"/>
+              <w:spacing w:after="160" w:line="259" w:lineRule="auto"/>
+              <w:rPr>
+                <w:b/>
+                <w:bCs/>
+              </w:rPr>
+            </w:pPr>
+            <w:r>
+              <w:rPr>
+                <w:b/>
+                <w:bCs/>
+              </w:rPr>
+              <w:t>Firmas (ambos integrantes): </w:t>
+            </w:r>
+          </w:p>
+          <w:p>
+            <w:pPr>
+              <w:rPr>
+                <w:b/>
+                <w:bCs/>
+              </w:rPr>
+            </w:pPr>
+          </w:p>
+        </w:tc>
+        <w:tc>
+          <w:tcPr>
+            <w:tcW w:w="7229" w:type="dxa"/>
           </w:tcPr>
           <w:p/>
         </w:tc>
@@ -1221,216 +1868,6 @@
                 <w:b/>
                 <w:bCs/>
               </w:rPr>
-              <w:t>Lo que hicimos esta semana (4-6 líneas): </w:t>
-            </w:r>
-          </w:p>
-        </w:tc>
-        <w:tc>
-          <w:tcPr>
-            <w:tcW w:w="5714" w:type="dxa"/>
-          </w:tcPr>
-          <w:p>
-            <w:r>
-              <w:t xml:space="preserve"> </w:t>
-            </w:r>
-          </w:p>
-        </w:tc>
-      </w:tr>
-      <w:tr>
-        <w:tc>
-          <w:tcPr>
-            <w:tcW w:w="3114" w:type="dxa"/>
-          </w:tcPr>
-          <w:p>
-            <w:pPr>
-              <w:spacing w:after="160" w:line="259" w:lineRule="auto"/>
-              <w:rPr>
-                <w:b/>
-                <w:bCs/>
-              </w:rPr>
-            </w:pPr>
-            <w:r>
-              <w:rPr>
-                <w:b/>
-                <w:bCs/>
-              </w:rPr>
-              <w:t>Problemas encontrados: </w:t>
-            </w:r>
-          </w:p>
-        </w:tc>
-        <w:tc>
-          <w:tcPr>
-            <w:tcW w:w="5714" w:type="dxa"/>
-          </w:tcPr>
-          <w:p/>
-        </w:tc>
-      </w:tr>
-      <w:tr>
-        <w:tc>
-          <w:tcPr>
-            <w:tcW w:w="3114" w:type="dxa"/>
-          </w:tcPr>
-          <w:p>
-            <w:pPr>
-              <w:spacing w:after="160" w:line="259" w:lineRule="auto"/>
-              <w:rPr>
-                <w:b/>
-                <w:bCs/>
-              </w:rPr>
-            </w:pPr>
-            <w:r>
-              <w:rPr>
-                <w:b/>
-                <w:bCs/>
-              </w:rPr>
-              <w:t>Cómo los resolvimos: </w:t>
-            </w:r>
-          </w:p>
-          <w:p>
-            <w:pPr>
-              <w:rPr>
-                <w:b/>
-                <w:bCs/>
-              </w:rPr>
-            </w:pPr>
-          </w:p>
-        </w:tc>
-        <w:tc>
-          <w:tcPr>
-            <w:tcW w:w="5714" w:type="dxa"/>
-          </w:tcPr>
-          <w:p/>
-        </w:tc>
-      </w:tr>
-      <w:tr>
-        <w:tc>
-          <w:tcPr>
-            <w:tcW w:w="3114" w:type="dxa"/>
-          </w:tcPr>
-          <w:p>
-            <w:pPr>
-              <w:spacing w:after="160" w:line="259" w:lineRule="auto"/>
-              <w:rPr>
-                <w:b/>
-                <w:bCs/>
-              </w:rPr>
-            </w:pPr>
-            <w:r>
-              <w:rPr>
-                <w:b/>
-                <w:bCs/>
-              </w:rPr>
-              <w:t>Usos de IA esta semana: </w:t>
-            </w:r>
-          </w:p>
-          <w:p>
-            <w:pPr>
-              <w:rPr>
-                <w:b/>
-                <w:bCs/>
-              </w:rPr>
-            </w:pPr>
-          </w:p>
-        </w:tc>
-        <w:tc>
-          <w:tcPr>
-            <w:tcW w:w="5714" w:type="dxa"/>
-          </w:tcPr>
-          <w:p/>
-        </w:tc>
-      </w:tr>
-      <w:tr>
-        <w:tc>
-          <w:tcPr>
-            <w:tcW w:w="3114" w:type="dxa"/>
-          </w:tcPr>
-          <w:p>
-            <w:pPr>
-              <w:spacing w:after="160" w:line="259" w:lineRule="auto"/>
-              <w:rPr>
-                <w:b/>
-                <w:bCs/>
-              </w:rPr>
-            </w:pPr>
-            <w:r>
-              <w:rPr>
-                <w:b/>
-                <w:bCs/>
-              </w:rPr>
-              <w:t>Próximos pasos: </w:t>
-            </w:r>
-          </w:p>
-          <w:p>
-            <w:pPr>
-              <w:rPr>
-                <w:b/>
-                <w:bCs/>
-              </w:rPr>
-            </w:pPr>
-          </w:p>
-        </w:tc>
-        <w:tc>
-          <w:tcPr>
-            <w:tcW w:w="5714" w:type="dxa"/>
-          </w:tcPr>
-          <w:p/>
-        </w:tc>
-      </w:tr>
-      <w:tr>
-        <w:tc>
-          <w:tcPr>
-            <w:tcW w:w="3114" w:type="dxa"/>
-          </w:tcPr>
-          <w:p>
-            <w:pPr>
-              <w:spacing w:after="160" w:line="259" w:lineRule="auto"/>
-              <w:rPr>
-                <w:b/>
-                <w:bCs/>
-              </w:rPr>
-            </w:pPr>
-            <w:r>
-              <w:rPr>
-                <w:b/>
-                <w:bCs/>
-              </w:rPr>
-              <w:t>Firmas (ambos integrantes): </w:t>
-            </w:r>
-          </w:p>
-          <w:p>
-            <w:pPr>
-              <w:rPr>
-                <w:b/>
-                <w:bCs/>
-              </w:rPr>
-            </w:pPr>
-          </w:p>
-        </w:tc>
-        <w:tc>
-          <w:tcPr>
-            <w:tcW w:w="5714" w:type="dxa"/>
-          </w:tcPr>
-          <w:p/>
-        </w:tc>
-      </w:tr>
-      <w:tr>
-        <w:tc>
-          <w:tcPr>
-            <w:tcW w:w="3114" w:type="dxa"/>
-          </w:tcPr>
-          <w:p>
-            <w:pPr>
-              <w:spacing w:after="160" w:line="259" w:lineRule="auto"/>
-              <w:rPr>
-                <w:b/>
-                <w:bCs/>
-              </w:rPr>
-            </w:pPr>
-            <w:r>
-              <w:rPr>
-                <w:b/>
-                <w:bCs/>
-              </w:rPr>
               <w:t>Firma docente: </w:t>
             </w:r>
           </w:p>
@@ -1445,7 +1882,7 @@
         </w:tc>
         <w:tc>
           <w:tcPr>
-            <w:tcW w:w="5714" w:type="dxa"/>
+            <w:tcW w:w="7229" w:type="dxa"/>
           </w:tcPr>
           <w:p/>
         </w:tc>
@@ -1453,320 +1890,1338 @@
     </w:tbl>
     <w:p/>
     <w:p/>
+    <w:p>
+      <w:r>
+        <w:t>Uso de la IA</w:t>
+      </w:r>
+    </w:p>
+    <w:p/>
     <w:tbl>
       <w:tblPr>
-        <w:tblStyle w:val="Tablaconcuadrcula"/>
-        <w:tblW w:w="0" w:type="auto"/>
+        <w:tblW w:w="8822" w:type="dxa"/>
+        <w:tblBorders>
+          <w:top w:val="outset" w:sz="6" w:space="0" w:color="auto"/>
+          <w:left w:val="outset" w:sz="6" w:space="0" w:color="auto"/>
+          <w:bottom w:val="outset" w:sz="6" w:space="0" w:color="auto"/>
+          <w:right w:val="outset" w:sz="6" w:space="0" w:color="auto"/>
+        </w:tblBorders>
+        <w:tblCellMar>
+          <w:left w:w="0" w:type="dxa"/>
+          <w:right w:w="0" w:type="dxa"/>
+        </w:tblCellMar>
         <w:tblLook w:val="04A0" w:firstRow="1" w:lastRow="0" w:firstColumn="1" w:lastColumn="0" w:noHBand="0" w:noVBand="1"/>
       </w:tblPr>
       <w:tblGrid>
-        <w:gridCol w:w="3114"/>
-        <w:gridCol w:w="5714"/>
+        <w:gridCol w:w="539"/>
+        <w:gridCol w:w="1331"/>
+        <w:gridCol w:w="1717"/>
+        <w:gridCol w:w="2363"/>
+        <w:gridCol w:w="2872"/>
       </w:tblGrid>
       <w:tr>
-        <w:tc>
-          <w:tcPr>
-            <w:tcW w:w="3114" w:type="dxa"/>
-          </w:tcPr>
-          <w:p>
-            <w:pPr>
-              <w:rPr>
-                <w:b/>
-                <w:bCs/>
-              </w:rPr>
-            </w:pPr>
-            <w:r>
-              <w:rPr>
-                <w:b/>
-                <w:bCs/>
-              </w:rPr>
-              <w:t xml:space="preserve">Sprint </w:t>
-            </w:r>
-            <w:proofErr w:type="spellStart"/>
-            <w:r>
-              <w:rPr>
-                <w:b/>
-                <w:bCs/>
-              </w:rPr>
-              <w:t>N°</w:t>
-            </w:r>
-            <w:proofErr w:type="spellEnd"/>
-          </w:p>
-        </w:tc>
-        <w:tc>
-          <w:tcPr>
-            <w:tcW w:w="5714" w:type="dxa"/>
+        <w:trPr>
+          <w:trHeight w:val="300"/>
+        </w:trPr>
+        <w:tc>
+          <w:tcPr>
+            <w:tcW w:w="539" w:type="dxa"/>
+            <w:tcBorders>
+              <w:top w:val="single" w:sz="6" w:space="0" w:color="888888"/>
+              <w:left w:val="single" w:sz="6" w:space="0" w:color="888888"/>
+              <w:bottom w:val="single" w:sz="6" w:space="0" w:color="888888"/>
+              <w:right w:val="single" w:sz="6" w:space="0" w:color="888888"/>
+            </w:tcBorders>
+            <w:shd w:val="clear" w:color="auto" w:fill="1F3864"/>
+            <w:hideMark/>
+          </w:tcPr>
+          <w:p>
+            <w:r>
+              <w:rPr>
+                <w:b/>
+                <w:bCs/>
+              </w:rPr>
+              <w:t>#</w:t>
+            </w:r>
+            <w:r>
+              <w:t> </w:t>
+            </w:r>
+          </w:p>
+        </w:tc>
+        <w:tc>
+          <w:tcPr>
+            <w:tcW w:w="1331" w:type="dxa"/>
+            <w:tcBorders>
+              <w:top w:val="single" w:sz="6" w:space="0" w:color="888888"/>
+              <w:left w:val="single" w:sz="6" w:space="0" w:color="888888"/>
+              <w:bottom w:val="single" w:sz="6" w:space="0" w:color="888888"/>
+              <w:right w:val="single" w:sz="6" w:space="0" w:color="888888"/>
+            </w:tcBorders>
+            <w:shd w:val="clear" w:color="auto" w:fill="1F3864"/>
+            <w:hideMark/>
+          </w:tcPr>
+          <w:p>
+            <w:proofErr w:type="spellStart"/>
+            <w:r>
+              <w:rPr>
+                <w:b/>
+                <w:bCs/>
+                <w:lang w:val="en-US"/>
+              </w:rPr>
+              <w:t>Fecha</w:t>
+            </w:r>
+            <w:proofErr w:type="spellEnd"/>
+            <w:r>
+              <w:t> </w:t>
+            </w:r>
+          </w:p>
+        </w:tc>
+        <w:tc>
+          <w:tcPr>
+            <w:tcW w:w="1717" w:type="dxa"/>
+            <w:tcBorders>
+              <w:top w:val="single" w:sz="6" w:space="0" w:color="888888"/>
+              <w:left w:val="single" w:sz="6" w:space="0" w:color="888888"/>
+              <w:bottom w:val="single" w:sz="6" w:space="0" w:color="888888"/>
+              <w:right w:val="single" w:sz="6" w:space="0" w:color="888888"/>
+            </w:tcBorders>
+            <w:shd w:val="clear" w:color="auto" w:fill="1F3864"/>
+            <w:hideMark/>
+          </w:tcPr>
+          <w:p>
+            <w:proofErr w:type="spellStart"/>
+            <w:r>
+              <w:rPr>
+                <w:b/>
+                <w:bCs/>
+                <w:lang w:val="en-US"/>
+              </w:rPr>
+              <w:t>Herramienta</w:t>
+            </w:r>
+            <w:proofErr w:type="spellEnd"/>
+            <w:r>
+              <w:t> </w:t>
+            </w:r>
+          </w:p>
+        </w:tc>
+        <w:tc>
+          <w:tcPr>
+            <w:tcW w:w="2363" w:type="dxa"/>
+            <w:tcBorders>
+              <w:top w:val="single" w:sz="6" w:space="0" w:color="888888"/>
+              <w:left w:val="single" w:sz="6" w:space="0" w:color="888888"/>
+              <w:bottom w:val="single" w:sz="6" w:space="0" w:color="888888"/>
+              <w:right w:val="single" w:sz="6" w:space="0" w:color="888888"/>
+            </w:tcBorders>
+            <w:shd w:val="clear" w:color="auto" w:fill="1F3864"/>
+            <w:hideMark/>
+          </w:tcPr>
+          <w:p>
+            <w:r>
+              <w:rPr>
+                <w:b/>
+                <w:bCs/>
+                <w:lang w:val="en-US"/>
+              </w:rPr>
+              <w:t>Prompt </w:t>
+            </w:r>
+            <w:proofErr w:type="spellStart"/>
+            <w:r>
+              <w:rPr>
+                <w:b/>
+                <w:bCs/>
+                <w:lang w:val="en-US"/>
+              </w:rPr>
+              <w:t>usado</w:t>
+            </w:r>
+            <w:proofErr w:type="spellEnd"/>
+            <w:r>
+              <w:rPr>
+                <w:b/>
+                <w:bCs/>
+                <w:lang w:val="en-US"/>
+              </w:rPr>
+              <w:t> (textual)</w:t>
+            </w:r>
+            <w:r>
+              <w:t> </w:t>
+            </w:r>
+          </w:p>
+        </w:tc>
+        <w:tc>
+          <w:tcPr>
+            <w:tcW w:w="2872" w:type="dxa"/>
+            <w:tcBorders>
+              <w:top w:val="single" w:sz="6" w:space="0" w:color="888888"/>
+              <w:left w:val="single" w:sz="6" w:space="0" w:color="888888"/>
+              <w:bottom w:val="single" w:sz="6" w:space="0" w:color="888888"/>
+              <w:right w:val="single" w:sz="6" w:space="0" w:color="888888"/>
+            </w:tcBorders>
+            <w:shd w:val="clear" w:color="auto" w:fill="1F3864"/>
+            <w:hideMark/>
+          </w:tcPr>
+          <w:p>
+            <w:proofErr w:type="spellStart"/>
+            <w:r>
+              <w:rPr>
+                <w:b/>
+                <w:bCs/>
+                <w:lang w:val="en-US"/>
+              </w:rPr>
+              <w:t>Cómo</w:t>
+            </w:r>
+            <w:proofErr w:type="spellEnd"/>
+            <w:r>
+              <w:rPr>
+                <w:b/>
+                <w:bCs/>
+                <w:lang w:val="en-US"/>
+              </w:rPr>
+              <w:t> se </w:t>
+            </w:r>
+            <w:proofErr w:type="spellStart"/>
+            <w:r>
+              <w:rPr>
+                <w:b/>
+                <w:bCs/>
+                <w:lang w:val="en-US"/>
+              </w:rPr>
+              <w:t>validó</w:t>
+            </w:r>
+            <w:proofErr w:type="spellEnd"/>
+            <w:r>
+              <w:rPr>
+                <w:b/>
+                <w:bCs/>
+                <w:lang w:val="en-US"/>
+              </w:rPr>
+              <w:t> la </w:t>
+            </w:r>
+            <w:proofErr w:type="spellStart"/>
+            <w:r>
+              <w:rPr>
+                <w:b/>
+                <w:bCs/>
+                <w:lang w:val="en-US"/>
+              </w:rPr>
+              <w:t>respuesta</w:t>
+            </w:r>
+            <w:proofErr w:type="spellEnd"/>
+            <w:r>
+              <w:t> </w:t>
+            </w:r>
+          </w:p>
+        </w:tc>
+      </w:tr>
+      <w:tr>
+        <w:trPr>
+          <w:trHeight w:val="300"/>
+        </w:trPr>
+        <w:tc>
+          <w:tcPr>
+            <w:tcW w:w="539" w:type="dxa"/>
+            <w:tcBorders>
+              <w:top w:val="single" w:sz="6" w:space="0" w:color="888888"/>
+              <w:left w:val="single" w:sz="6" w:space="0" w:color="888888"/>
+              <w:bottom w:val="single" w:sz="6" w:space="0" w:color="888888"/>
+              <w:right w:val="single" w:sz="6" w:space="0" w:color="888888"/>
+            </w:tcBorders>
+            <w:hideMark/>
+          </w:tcPr>
+          <w:p>
+            <w:r>
+              <w:t>1 </w:t>
+            </w:r>
+          </w:p>
+        </w:tc>
+        <w:tc>
+          <w:tcPr>
+            <w:tcW w:w="1331" w:type="dxa"/>
+            <w:tcBorders>
+              <w:top w:val="single" w:sz="6" w:space="0" w:color="888888"/>
+              <w:left w:val="single" w:sz="6" w:space="0" w:color="888888"/>
+              <w:bottom w:val="single" w:sz="6" w:space="0" w:color="888888"/>
+              <w:right w:val="single" w:sz="6" w:space="0" w:color="888888"/>
+            </w:tcBorders>
+            <w:vAlign w:val="center"/>
+            <w:hideMark/>
+          </w:tcPr>
+          <w:p>
+            <w:r>
+              <w:t>07</w:t>
+            </w:r>
+            <w:r>
+              <w:t>/06/2026</w:t>
+            </w:r>
+          </w:p>
+        </w:tc>
+        <w:tc>
+          <w:tcPr>
+            <w:tcW w:w="1717" w:type="dxa"/>
+            <w:tcBorders>
+              <w:top w:val="single" w:sz="6" w:space="0" w:color="888888"/>
+              <w:left w:val="single" w:sz="6" w:space="0" w:color="888888"/>
+              <w:bottom w:val="single" w:sz="6" w:space="0" w:color="888888"/>
+              <w:right w:val="single" w:sz="6" w:space="0" w:color="888888"/>
+            </w:tcBorders>
+            <w:vAlign w:val="center"/>
+            <w:hideMark/>
+          </w:tcPr>
+          <w:p>
+            <w:proofErr w:type="spellStart"/>
+            <w:r>
+              <w:t>ChatGPT</w:t>
+            </w:r>
+            <w:proofErr w:type="spellEnd"/>
+          </w:p>
+        </w:tc>
+        <w:tc>
+          <w:tcPr>
+            <w:tcW w:w="2363" w:type="dxa"/>
+            <w:tcBorders>
+              <w:top w:val="single" w:sz="6" w:space="0" w:color="888888"/>
+              <w:left w:val="single" w:sz="6" w:space="0" w:color="888888"/>
+              <w:bottom w:val="single" w:sz="6" w:space="0" w:color="888888"/>
+              <w:right w:val="single" w:sz="6" w:space="0" w:color="888888"/>
+            </w:tcBorders>
+            <w:vAlign w:val="center"/>
+            <w:hideMark/>
+          </w:tcPr>
+          <w:p>
+            <w:r>
+              <w:t xml:space="preserve">“Cómo limitar el tamaño de archivos en </w:t>
+            </w:r>
+            <w:proofErr w:type="spellStart"/>
+            <w:r>
+              <w:t>FastAPI</w:t>
+            </w:r>
+            <w:proofErr w:type="spellEnd"/>
+            <w:r>
+              <w:t xml:space="preserve"> al subir a S3 y sincronizarlo con validación en </w:t>
+            </w:r>
+            <w:proofErr w:type="spellStart"/>
+            <w:r>
+              <w:t>frontend</w:t>
+            </w:r>
+            <w:proofErr w:type="spellEnd"/>
+            <w:r>
+              <w:t>”</w:t>
+            </w:r>
+          </w:p>
+        </w:tc>
+        <w:tc>
+          <w:tcPr>
+            <w:tcW w:w="2872" w:type="dxa"/>
+            <w:tcBorders>
+              <w:top w:val="single" w:sz="6" w:space="0" w:color="888888"/>
+              <w:left w:val="single" w:sz="6" w:space="0" w:color="888888"/>
+              <w:bottom w:val="single" w:sz="6" w:space="0" w:color="888888"/>
+              <w:right w:val="single" w:sz="6" w:space="0" w:color="888888"/>
+            </w:tcBorders>
+            <w:vAlign w:val="center"/>
+            <w:hideMark/>
+          </w:tcPr>
+          <w:p>
+            <w:r>
+              <w:t xml:space="preserve">Se probó subiendo archivos de distintos tamaños y verificando que el </w:t>
+            </w:r>
+            <w:proofErr w:type="spellStart"/>
+            <w:r>
+              <w:t>backend</w:t>
+            </w:r>
+            <w:proofErr w:type="spellEnd"/>
+            <w:r>
+              <w:t xml:space="preserve"> rechazara correctamente los que superaban el límite de 18MB.</w:t>
+            </w:r>
+          </w:p>
+        </w:tc>
+      </w:tr>
+      <w:tr>
+        <w:trPr>
+          <w:trHeight w:val="300"/>
+        </w:trPr>
+        <w:tc>
+          <w:tcPr>
+            <w:tcW w:w="539" w:type="dxa"/>
+            <w:tcBorders>
+              <w:top w:val="single" w:sz="6" w:space="0" w:color="888888"/>
+              <w:left w:val="single" w:sz="6" w:space="0" w:color="888888"/>
+              <w:bottom w:val="single" w:sz="6" w:space="0" w:color="888888"/>
+              <w:right w:val="single" w:sz="6" w:space="0" w:color="888888"/>
+            </w:tcBorders>
+            <w:hideMark/>
+          </w:tcPr>
+          <w:p>
+            <w:r>
+              <w:t>2 </w:t>
+            </w:r>
+          </w:p>
+        </w:tc>
+        <w:tc>
+          <w:tcPr>
+            <w:tcW w:w="1331" w:type="dxa"/>
+            <w:tcBorders>
+              <w:top w:val="single" w:sz="6" w:space="0" w:color="888888"/>
+              <w:left w:val="single" w:sz="6" w:space="0" w:color="888888"/>
+              <w:bottom w:val="single" w:sz="6" w:space="0" w:color="888888"/>
+              <w:right w:val="single" w:sz="6" w:space="0" w:color="888888"/>
+            </w:tcBorders>
+            <w:vAlign w:val="center"/>
+            <w:hideMark/>
+          </w:tcPr>
+          <w:p>
+            <w:r>
+              <w:t>08</w:t>
+            </w:r>
+            <w:r>
+              <w:t>/06/2026</w:t>
+            </w:r>
+          </w:p>
+        </w:tc>
+        <w:tc>
+          <w:tcPr>
+            <w:tcW w:w="1717" w:type="dxa"/>
+            <w:tcBorders>
+              <w:top w:val="single" w:sz="6" w:space="0" w:color="888888"/>
+              <w:left w:val="single" w:sz="6" w:space="0" w:color="888888"/>
+              <w:bottom w:val="single" w:sz="6" w:space="0" w:color="888888"/>
+              <w:right w:val="single" w:sz="6" w:space="0" w:color="888888"/>
+            </w:tcBorders>
+            <w:vAlign w:val="center"/>
+            <w:hideMark/>
+          </w:tcPr>
+          <w:p>
+            <w:proofErr w:type="spellStart"/>
+            <w:r>
+              <w:t>ChatGPT</w:t>
+            </w:r>
+            <w:proofErr w:type="spellEnd"/>
+          </w:p>
+        </w:tc>
+        <w:tc>
+          <w:tcPr>
+            <w:tcW w:w="2363" w:type="dxa"/>
+            <w:tcBorders>
+              <w:top w:val="single" w:sz="6" w:space="0" w:color="888888"/>
+              <w:left w:val="single" w:sz="6" w:space="0" w:color="888888"/>
+              <w:bottom w:val="single" w:sz="6" w:space="0" w:color="888888"/>
+              <w:right w:val="single" w:sz="6" w:space="0" w:color="888888"/>
+            </w:tcBorders>
+            <w:vAlign w:val="center"/>
+            <w:hideMark/>
+          </w:tcPr>
+          <w:p>
+            <w:r>
+              <w:t xml:space="preserve">“Error común al estandarizar variables entre </w:t>
+            </w:r>
+            <w:proofErr w:type="spellStart"/>
+            <w:r>
+              <w:t>frontend</w:t>
+            </w:r>
+            <w:proofErr w:type="spellEnd"/>
+            <w:r>
+              <w:t xml:space="preserve"> </w:t>
+            </w:r>
+            <w:proofErr w:type="spellStart"/>
+            <w:r>
+              <w:t>React</w:t>
+            </w:r>
+            <w:proofErr w:type="spellEnd"/>
+            <w:r>
+              <w:t xml:space="preserve"> y </w:t>
+            </w:r>
+            <w:proofErr w:type="spellStart"/>
+            <w:r>
+              <w:t>backend</w:t>
+            </w:r>
+            <w:proofErr w:type="spellEnd"/>
+            <w:r>
+              <w:t xml:space="preserve"> </w:t>
+            </w:r>
+            <w:proofErr w:type="spellStart"/>
+            <w:r>
+              <w:t>FastAPI</w:t>
+            </w:r>
+            <w:proofErr w:type="spellEnd"/>
+            <w:r>
+              <w:t xml:space="preserve"> en subida de archivos”</w:t>
+            </w:r>
+          </w:p>
+        </w:tc>
+        <w:tc>
+          <w:tcPr>
+            <w:tcW w:w="2872" w:type="dxa"/>
+            <w:tcBorders>
+              <w:top w:val="single" w:sz="6" w:space="0" w:color="888888"/>
+              <w:left w:val="single" w:sz="6" w:space="0" w:color="888888"/>
+              <w:bottom w:val="single" w:sz="6" w:space="0" w:color="888888"/>
+              <w:right w:val="single" w:sz="6" w:space="0" w:color="888888"/>
+            </w:tcBorders>
+            <w:vAlign w:val="center"/>
+            <w:hideMark/>
+          </w:tcPr>
+          <w:p>
+            <w:r>
+              <w:t xml:space="preserve">Se revisó el código completo y se comprobó la consistencia de nombres de variables entre componentes y </w:t>
+            </w:r>
+            <w:proofErr w:type="spellStart"/>
+            <w:r>
+              <w:t>endpoints</w:t>
+            </w:r>
+            <w:proofErr w:type="spellEnd"/>
+            <w:r>
+              <w:t>.</w:t>
+            </w:r>
+          </w:p>
+        </w:tc>
+      </w:tr>
+      <w:tr>
+        <w:trPr>
+          <w:trHeight w:val="300"/>
+        </w:trPr>
+        <w:tc>
+          <w:tcPr>
+            <w:tcW w:w="539" w:type="dxa"/>
+            <w:tcBorders>
+              <w:top w:val="single" w:sz="6" w:space="0" w:color="888888"/>
+              <w:left w:val="single" w:sz="6" w:space="0" w:color="888888"/>
+              <w:bottom w:val="single" w:sz="6" w:space="0" w:color="888888"/>
+              <w:right w:val="single" w:sz="6" w:space="0" w:color="888888"/>
+            </w:tcBorders>
+            <w:hideMark/>
+          </w:tcPr>
+          <w:p>
+            <w:r>
+              <w:t>3 </w:t>
+            </w:r>
+          </w:p>
+        </w:tc>
+        <w:tc>
+          <w:tcPr>
+            <w:tcW w:w="1331" w:type="dxa"/>
+            <w:tcBorders>
+              <w:top w:val="single" w:sz="6" w:space="0" w:color="888888"/>
+              <w:left w:val="single" w:sz="6" w:space="0" w:color="888888"/>
+              <w:bottom w:val="single" w:sz="6" w:space="0" w:color="888888"/>
+              <w:right w:val="single" w:sz="6" w:space="0" w:color="888888"/>
+            </w:tcBorders>
+            <w:vAlign w:val="center"/>
+            <w:hideMark/>
+          </w:tcPr>
+          <w:p>
+            <w:r>
+              <w:t>1</w:t>
+            </w:r>
+            <w:r>
+              <w:t>5</w:t>
+            </w:r>
+            <w:r>
+              <w:t>/06/2026</w:t>
+            </w:r>
+          </w:p>
+        </w:tc>
+        <w:tc>
+          <w:tcPr>
+            <w:tcW w:w="1717" w:type="dxa"/>
+            <w:tcBorders>
+              <w:top w:val="single" w:sz="6" w:space="0" w:color="888888"/>
+              <w:left w:val="single" w:sz="6" w:space="0" w:color="888888"/>
+              <w:bottom w:val="single" w:sz="6" w:space="0" w:color="888888"/>
+              <w:right w:val="single" w:sz="6" w:space="0" w:color="888888"/>
+            </w:tcBorders>
+            <w:vAlign w:val="center"/>
+            <w:hideMark/>
+          </w:tcPr>
+          <w:p>
+            <w:proofErr w:type="spellStart"/>
+            <w:r>
+              <w:t>ChatGPT</w:t>
+            </w:r>
+            <w:proofErr w:type="spellEnd"/>
+          </w:p>
+        </w:tc>
+        <w:tc>
+          <w:tcPr>
+            <w:tcW w:w="2363" w:type="dxa"/>
+            <w:tcBorders>
+              <w:top w:val="single" w:sz="6" w:space="0" w:color="888888"/>
+              <w:left w:val="single" w:sz="6" w:space="0" w:color="888888"/>
+              <w:bottom w:val="single" w:sz="6" w:space="0" w:color="888888"/>
+              <w:right w:val="single" w:sz="6" w:space="0" w:color="888888"/>
+            </w:tcBorders>
+            <w:vAlign w:val="center"/>
+            <w:hideMark/>
+          </w:tcPr>
+          <w:p>
+            <w:r>
+              <w:t xml:space="preserve">“Cómo sincronizar correctamente lista de archivos entre </w:t>
+            </w:r>
+            <w:proofErr w:type="spellStart"/>
+            <w:r>
+              <w:t>FastAPI</w:t>
+            </w:r>
+            <w:proofErr w:type="spellEnd"/>
+            <w:r>
+              <w:t xml:space="preserve"> y </w:t>
+            </w:r>
+            <w:proofErr w:type="spellStart"/>
+            <w:r>
+              <w:t>React</w:t>
+            </w:r>
+            <w:proofErr w:type="spellEnd"/>
+            <w:r>
+              <w:t xml:space="preserve"> después de subir o eliminar archivos en S3”</w:t>
+            </w:r>
+          </w:p>
+        </w:tc>
+        <w:tc>
+          <w:tcPr>
+            <w:tcW w:w="2872" w:type="dxa"/>
+            <w:tcBorders>
+              <w:top w:val="single" w:sz="6" w:space="0" w:color="888888"/>
+              <w:left w:val="single" w:sz="6" w:space="0" w:color="888888"/>
+              <w:bottom w:val="single" w:sz="6" w:space="0" w:color="888888"/>
+              <w:right w:val="single" w:sz="6" w:space="0" w:color="888888"/>
+            </w:tcBorders>
+            <w:vAlign w:val="center"/>
+            <w:hideMark/>
+          </w:tcPr>
+          <w:p>
+            <w:r>
+              <w:t xml:space="preserve">Se validó con pruebas manuales de carga/eliminación observando actualización automática del listado en </w:t>
+            </w:r>
+            <w:proofErr w:type="spellStart"/>
+            <w:r>
+              <w:t>frontend</w:t>
+            </w:r>
+            <w:proofErr w:type="spellEnd"/>
+            <w:r>
+              <w:t>.</w:t>
+            </w:r>
+          </w:p>
+        </w:tc>
+      </w:tr>
+      <w:tr>
+        <w:trPr>
+          <w:trHeight w:val="300"/>
+        </w:trPr>
+        <w:tc>
+          <w:tcPr>
+            <w:tcW w:w="539" w:type="dxa"/>
+            <w:tcBorders>
+              <w:top w:val="single" w:sz="6" w:space="0" w:color="888888"/>
+              <w:left w:val="single" w:sz="6" w:space="0" w:color="888888"/>
+              <w:bottom w:val="single" w:sz="6" w:space="0" w:color="888888"/>
+              <w:right w:val="single" w:sz="6" w:space="0" w:color="888888"/>
+            </w:tcBorders>
+            <w:hideMark/>
+          </w:tcPr>
+          <w:p>
+            <w:r>
+              <w:t>4 </w:t>
+            </w:r>
+          </w:p>
+        </w:tc>
+        <w:tc>
+          <w:tcPr>
+            <w:tcW w:w="1331" w:type="dxa"/>
+            <w:tcBorders>
+              <w:top w:val="single" w:sz="6" w:space="0" w:color="888888"/>
+              <w:left w:val="single" w:sz="6" w:space="0" w:color="888888"/>
+              <w:bottom w:val="single" w:sz="6" w:space="0" w:color="888888"/>
+              <w:right w:val="single" w:sz="6" w:space="0" w:color="888888"/>
+            </w:tcBorders>
+            <w:vAlign w:val="center"/>
+            <w:hideMark/>
+          </w:tcPr>
+          <w:p>
+            <w:r>
+              <w:t>1</w:t>
+            </w:r>
+            <w:r>
+              <w:t>5</w:t>
+            </w:r>
+            <w:r>
+              <w:t>/06/2026</w:t>
+            </w:r>
+          </w:p>
+        </w:tc>
+        <w:tc>
+          <w:tcPr>
+            <w:tcW w:w="1717" w:type="dxa"/>
+            <w:tcBorders>
+              <w:top w:val="single" w:sz="6" w:space="0" w:color="888888"/>
+              <w:left w:val="single" w:sz="6" w:space="0" w:color="888888"/>
+              <w:bottom w:val="single" w:sz="6" w:space="0" w:color="888888"/>
+              <w:right w:val="single" w:sz="6" w:space="0" w:color="888888"/>
+            </w:tcBorders>
+            <w:vAlign w:val="center"/>
+            <w:hideMark/>
+          </w:tcPr>
+          <w:p>
+            <w:proofErr w:type="spellStart"/>
+            <w:r>
+              <w:t>ChatGPT</w:t>
+            </w:r>
+            <w:proofErr w:type="spellEnd"/>
+          </w:p>
+        </w:tc>
+        <w:tc>
+          <w:tcPr>
+            <w:tcW w:w="2363" w:type="dxa"/>
+            <w:tcBorders>
+              <w:top w:val="single" w:sz="6" w:space="0" w:color="888888"/>
+              <w:left w:val="single" w:sz="6" w:space="0" w:color="888888"/>
+              <w:bottom w:val="single" w:sz="6" w:space="0" w:color="888888"/>
+              <w:right w:val="single" w:sz="6" w:space="0" w:color="888888"/>
+            </w:tcBorders>
+            <w:vAlign w:val="center"/>
+            <w:hideMark/>
+          </w:tcPr>
+          <w:p>
+            <w:r>
+              <w:t xml:space="preserve">“Errores comunes al trabajar con S3 y </w:t>
+            </w:r>
+            <w:proofErr w:type="spellStart"/>
+            <w:r>
+              <w:t>FastAPI</w:t>
+            </w:r>
+            <w:proofErr w:type="spellEnd"/>
+            <w:r>
+              <w:t xml:space="preserve"> usando boto3 y cómo depurarlos”</w:t>
+            </w:r>
+          </w:p>
+        </w:tc>
+        <w:tc>
+          <w:tcPr>
+            <w:tcW w:w="2872" w:type="dxa"/>
+            <w:tcBorders>
+              <w:top w:val="single" w:sz="6" w:space="0" w:color="888888"/>
+              <w:left w:val="single" w:sz="6" w:space="0" w:color="888888"/>
+              <w:bottom w:val="single" w:sz="6" w:space="0" w:color="888888"/>
+              <w:right w:val="single" w:sz="6" w:space="0" w:color="888888"/>
+            </w:tcBorders>
+            <w:vAlign w:val="center"/>
+            <w:hideMark/>
+          </w:tcPr>
+          <w:p>
+            <w:r>
+              <w:t xml:space="preserve">Se revisaron logs del </w:t>
+            </w:r>
+            <w:proofErr w:type="spellStart"/>
+            <w:r>
+              <w:t>backend</w:t>
+            </w:r>
+            <w:proofErr w:type="spellEnd"/>
+            <w:r>
+              <w:t xml:space="preserve"> y se verificó que los </w:t>
+            </w:r>
+            <w:proofErr w:type="spellStart"/>
+            <w:r>
+              <w:t>endpoints</w:t>
+            </w:r>
+            <w:proofErr w:type="spellEnd"/>
+            <w:r>
+              <w:t xml:space="preserve"> respondieran correctamente sin errores en consola.</w:t>
+            </w:r>
+          </w:p>
+        </w:tc>
+      </w:tr>
+      <w:tr>
+        <w:trPr>
+          <w:trHeight w:val="300"/>
+        </w:trPr>
+        <w:tc>
+          <w:tcPr>
+            <w:tcW w:w="539" w:type="dxa"/>
+            <w:tcBorders>
+              <w:top w:val="single" w:sz="6" w:space="0" w:color="888888"/>
+              <w:left w:val="single" w:sz="6" w:space="0" w:color="888888"/>
+              <w:bottom w:val="single" w:sz="6" w:space="0" w:color="888888"/>
+              <w:right w:val="single" w:sz="6" w:space="0" w:color="888888"/>
+            </w:tcBorders>
+            <w:hideMark/>
+          </w:tcPr>
+          <w:p>
+            <w:r>
+              <w:t>5 </w:t>
+            </w:r>
+          </w:p>
+        </w:tc>
+        <w:tc>
+          <w:tcPr>
+            <w:tcW w:w="1331" w:type="dxa"/>
+            <w:tcBorders>
+              <w:top w:val="single" w:sz="6" w:space="0" w:color="888888"/>
+              <w:left w:val="single" w:sz="6" w:space="0" w:color="888888"/>
+              <w:bottom w:val="single" w:sz="6" w:space="0" w:color="888888"/>
+              <w:right w:val="single" w:sz="6" w:space="0" w:color="888888"/>
+            </w:tcBorders>
+            <w:vAlign w:val="center"/>
+            <w:hideMark/>
+          </w:tcPr>
+          <w:p>
+            <w:r>
+              <w:t>2</w:t>
+            </w:r>
+            <w:r>
+              <w:t>3</w:t>
+            </w:r>
+            <w:r>
+              <w:t>/06/2026</w:t>
+            </w:r>
+          </w:p>
+        </w:tc>
+        <w:tc>
+          <w:tcPr>
+            <w:tcW w:w="1717" w:type="dxa"/>
+            <w:tcBorders>
+              <w:top w:val="single" w:sz="6" w:space="0" w:color="888888"/>
+              <w:left w:val="single" w:sz="6" w:space="0" w:color="888888"/>
+              <w:bottom w:val="single" w:sz="6" w:space="0" w:color="888888"/>
+              <w:right w:val="single" w:sz="6" w:space="0" w:color="888888"/>
+            </w:tcBorders>
+            <w:vAlign w:val="center"/>
+            <w:hideMark/>
+          </w:tcPr>
+          <w:p>
+            <w:r>
+              <w:t>Gemini</w:t>
+            </w:r>
+          </w:p>
+        </w:tc>
+        <w:tc>
+          <w:tcPr>
+            <w:tcW w:w="2363" w:type="dxa"/>
+            <w:tcBorders>
+              <w:top w:val="single" w:sz="6" w:space="0" w:color="888888"/>
+              <w:left w:val="single" w:sz="6" w:space="0" w:color="888888"/>
+              <w:bottom w:val="single" w:sz="6" w:space="0" w:color="888888"/>
+              <w:right w:val="single" w:sz="6" w:space="0" w:color="888888"/>
+            </w:tcBorders>
+            <w:vAlign w:val="center"/>
+            <w:hideMark/>
+          </w:tcPr>
+          <w:p>
+            <w:r>
+              <w:t xml:space="preserve">“Configuración correcta de CORS en </w:t>
+            </w:r>
+            <w:proofErr w:type="spellStart"/>
+            <w:r>
+              <w:t>FastAPI</w:t>
+            </w:r>
+            <w:proofErr w:type="spellEnd"/>
+            <w:r>
+              <w:t xml:space="preserve"> para permitir comunicación con </w:t>
+            </w:r>
+            <w:proofErr w:type="spellStart"/>
+            <w:r>
+              <w:t>frontend</w:t>
+            </w:r>
+            <w:proofErr w:type="spellEnd"/>
+            <w:r>
+              <w:t xml:space="preserve"> en desarrollo y producción”</w:t>
+            </w:r>
+          </w:p>
+        </w:tc>
+        <w:tc>
+          <w:tcPr>
+            <w:tcW w:w="2872" w:type="dxa"/>
+            <w:tcBorders>
+              <w:top w:val="single" w:sz="6" w:space="0" w:color="888888"/>
+              <w:left w:val="single" w:sz="6" w:space="0" w:color="888888"/>
+              <w:bottom w:val="single" w:sz="6" w:space="0" w:color="888888"/>
+              <w:right w:val="single" w:sz="6" w:space="0" w:color="888888"/>
+            </w:tcBorders>
+            <w:vAlign w:val="center"/>
+            <w:hideMark/>
+          </w:tcPr>
+          <w:p>
+            <w:r>
+              <w:t xml:space="preserve">Se probó la conexión </w:t>
+            </w:r>
+            <w:proofErr w:type="spellStart"/>
+            <w:r>
+              <w:t>frontend-backend</w:t>
+            </w:r>
+            <w:proofErr w:type="spellEnd"/>
+            <w:r>
+              <w:t xml:space="preserve"> en local y despliegue, verificando eliminación de errores de bloqueo por CORS.</w:t>
+            </w:r>
+          </w:p>
+        </w:tc>
+      </w:tr>
+      <w:tr>
+        <w:trPr>
+          <w:trHeight w:val="300"/>
+        </w:trPr>
+        <w:tc>
+          <w:tcPr>
+            <w:tcW w:w="539" w:type="dxa"/>
+            <w:tcBorders>
+              <w:top w:val="single" w:sz="6" w:space="0" w:color="888888"/>
+              <w:left w:val="single" w:sz="6" w:space="0" w:color="888888"/>
+              <w:bottom w:val="single" w:sz="6" w:space="0" w:color="888888"/>
+              <w:right w:val="single" w:sz="6" w:space="0" w:color="888888"/>
+            </w:tcBorders>
+            <w:hideMark/>
+          </w:tcPr>
+          <w:p>
+            <w:r>
+              <w:lastRenderedPageBreak/>
+              <w:t>6 </w:t>
+            </w:r>
+          </w:p>
+        </w:tc>
+        <w:tc>
+          <w:tcPr>
+            <w:tcW w:w="1331" w:type="dxa"/>
+            <w:tcBorders>
+              <w:top w:val="single" w:sz="6" w:space="0" w:color="888888"/>
+              <w:left w:val="single" w:sz="6" w:space="0" w:color="888888"/>
+              <w:bottom w:val="single" w:sz="6" w:space="0" w:color="888888"/>
+              <w:right w:val="single" w:sz="6" w:space="0" w:color="888888"/>
+            </w:tcBorders>
+            <w:vAlign w:val="center"/>
+            <w:hideMark/>
+          </w:tcPr>
+          <w:p>
+            <w:r>
+              <w:t>29</w:t>
+            </w:r>
+            <w:r>
+              <w:t>/0</w:t>
+            </w:r>
+            <w:r>
+              <w:t>6</w:t>
+            </w:r>
+            <w:r>
+              <w:t>/2026</w:t>
+            </w:r>
+          </w:p>
+        </w:tc>
+        <w:tc>
+          <w:tcPr>
+            <w:tcW w:w="1717" w:type="dxa"/>
+            <w:tcBorders>
+              <w:top w:val="single" w:sz="6" w:space="0" w:color="888888"/>
+              <w:left w:val="single" w:sz="6" w:space="0" w:color="888888"/>
+              <w:bottom w:val="single" w:sz="6" w:space="0" w:color="888888"/>
+              <w:right w:val="single" w:sz="6" w:space="0" w:color="888888"/>
+            </w:tcBorders>
+            <w:vAlign w:val="center"/>
+            <w:hideMark/>
+          </w:tcPr>
+          <w:p>
+            <w:r>
+              <w:t>C</w:t>
+            </w:r>
+            <w:r>
+              <w:t>laude</w:t>
+            </w:r>
+          </w:p>
+        </w:tc>
+        <w:tc>
+          <w:tcPr>
+            <w:tcW w:w="2363" w:type="dxa"/>
+            <w:tcBorders>
+              <w:top w:val="single" w:sz="6" w:space="0" w:color="888888"/>
+              <w:left w:val="single" w:sz="6" w:space="0" w:color="888888"/>
+              <w:bottom w:val="single" w:sz="6" w:space="0" w:color="888888"/>
+              <w:right w:val="single" w:sz="6" w:space="0" w:color="888888"/>
+            </w:tcBorders>
+            <w:vAlign w:val="center"/>
+            <w:hideMark/>
+          </w:tcPr>
+          <w:p>
+            <w:r>
+              <w:t xml:space="preserve">“Cómo integrar </w:t>
+            </w:r>
+            <w:proofErr w:type="spellStart"/>
+            <w:r>
+              <w:t>DynamoDB</w:t>
+            </w:r>
+            <w:proofErr w:type="spellEnd"/>
+            <w:r>
+              <w:t xml:space="preserve"> con </w:t>
+            </w:r>
+            <w:proofErr w:type="spellStart"/>
+            <w:r>
+              <w:t>FastAPI</w:t>
+            </w:r>
+            <w:proofErr w:type="spellEnd"/>
+            <w:r>
+              <w:t xml:space="preserve"> usando boto3 y sincronizarlo con eventos de subida y eliminación en S3”</w:t>
+            </w:r>
+          </w:p>
+        </w:tc>
+        <w:tc>
+          <w:tcPr>
+            <w:tcW w:w="2872" w:type="dxa"/>
+            <w:tcBorders>
+              <w:top w:val="single" w:sz="6" w:space="0" w:color="888888"/>
+              <w:left w:val="single" w:sz="6" w:space="0" w:color="888888"/>
+              <w:bottom w:val="single" w:sz="6" w:space="0" w:color="888888"/>
+              <w:right w:val="single" w:sz="6" w:space="0" w:color="888888"/>
+            </w:tcBorders>
+            <w:vAlign w:val="center"/>
+            <w:hideMark/>
+          </w:tcPr>
+          <w:p>
+            <w:r>
+              <w:t xml:space="preserve">Se validó con inserción y eliminación de archivos, verificando que los registros en </w:t>
+            </w:r>
+            <w:proofErr w:type="spellStart"/>
+            <w:r>
+              <w:t>DynamoDB</w:t>
+            </w:r>
+            <w:proofErr w:type="spellEnd"/>
+            <w:r>
+              <w:t xml:space="preserve"> coincidieran con los del </w:t>
+            </w:r>
+            <w:proofErr w:type="spellStart"/>
+            <w:r>
+              <w:t>bucket</w:t>
+            </w:r>
+            <w:proofErr w:type="spellEnd"/>
+            <w:r>
+              <w:t xml:space="preserve"> S3.</w:t>
+            </w:r>
+          </w:p>
+        </w:tc>
+      </w:tr>
+    </w:tbl>
+    <w:p/>
+    <w:tbl>
+      <w:tblPr>
+        <w:tblW w:w="0" w:type="auto"/>
+        <w:tblCellSpacing w:w="15" w:type="dxa"/>
+        <w:tblCellMar>
+          <w:top w:w="15" w:type="dxa"/>
+          <w:left w:w="15" w:type="dxa"/>
+          <w:bottom w:w="15" w:type="dxa"/>
+          <w:right w:w="15" w:type="dxa"/>
+        </w:tblCellMar>
+        <w:tblLook w:val="04A0" w:firstRow="1" w:lastRow="0" w:firstColumn="1" w:lastColumn="0" w:noHBand="0" w:noVBand="1"/>
+      </w:tblPr>
+      <w:tblGrid>
+        <w:gridCol w:w="426"/>
+        <w:gridCol w:w="918"/>
+        <w:gridCol w:w="66"/>
+        <w:gridCol w:w="66"/>
+        <w:gridCol w:w="81"/>
+      </w:tblGrid>
+      <w:tr>
+        <w:trPr>
+          <w:tblHeader/>
+          <w:tblCellSpacing w:w="15" w:type="dxa"/>
+        </w:trPr>
+        <w:tc>
+          <w:tcPr>
+            <w:tcW w:w="381" w:type="dxa"/>
+            <w:vAlign w:val="center"/>
+          </w:tcPr>
+          <w:p>
+            <w:pPr>
+              <w:rPr>
+                <w:b/>
+                <w:bCs/>
+              </w:rPr>
+            </w:pPr>
+          </w:p>
+        </w:tc>
+        <w:tc>
+          <w:tcPr>
+            <w:tcW w:w="888" w:type="dxa"/>
+            <w:vAlign w:val="center"/>
+          </w:tcPr>
+          <w:p>
+            <w:pPr>
+              <w:rPr>
+                <w:b/>
+                <w:bCs/>
+              </w:rPr>
+            </w:pPr>
+          </w:p>
+        </w:tc>
+        <w:tc>
+          <w:tcPr>
+            <w:tcW w:w="0" w:type="auto"/>
+            <w:vAlign w:val="center"/>
+          </w:tcPr>
+          <w:p>
+            <w:pPr>
+              <w:rPr>
+                <w:b/>
+                <w:bCs/>
+              </w:rPr>
+            </w:pPr>
+          </w:p>
+        </w:tc>
+        <w:tc>
+          <w:tcPr>
+            <w:tcW w:w="0" w:type="auto"/>
+            <w:vAlign w:val="center"/>
+          </w:tcPr>
+          <w:p>
+            <w:pPr>
+              <w:rPr>
+                <w:b/>
+                <w:bCs/>
+              </w:rPr>
+            </w:pPr>
+          </w:p>
+        </w:tc>
+        <w:tc>
+          <w:tcPr>
+            <w:tcW w:w="0" w:type="auto"/>
+            <w:vAlign w:val="center"/>
+          </w:tcPr>
+          <w:p>
+            <w:pPr>
+              <w:rPr>
+                <w:b/>
+                <w:bCs/>
+              </w:rPr>
+            </w:pPr>
+          </w:p>
+        </w:tc>
+      </w:tr>
+      <w:tr>
+        <w:trPr>
+          <w:tblCellSpacing w:w="15" w:type="dxa"/>
+        </w:trPr>
+        <w:tc>
+          <w:tcPr>
+            <w:tcW w:w="381" w:type="dxa"/>
+            <w:vAlign w:val="center"/>
           </w:tcPr>
           <w:p/>
         </w:tc>
-      </w:tr>
-      <w:tr>
-        <w:tc>
-          <w:tcPr>
-            <w:tcW w:w="3114" w:type="dxa"/>
-          </w:tcPr>
-          <w:p>
-            <w:pPr>
-              <w:rPr>
-                <w:b/>
-                <w:bCs/>
-              </w:rPr>
-            </w:pPr>
-            <w:r>
-              <w:rPr>
-                <w:b/>
-                <w:bCs/>
-              </w:rPr>
-              <w:t>Fecha</w:t>
-            </w:r>
-          </w:p>
-        </w:tc>
-        <w:tc>
-          <w:tcPr>
-            <w:tcW w:w="5714" w:type="dxa"/>
+        <w:tc>
+          <w:tcPr>
+            <w:tcW w:w="888" w:type="dxa"/>
+            <w:vAlign w:val="center"/>
           </w:tcPr>
           <w:p/>
         </w:tc>
-      </w:tr>
-      <w:tr>
-        <w:tc>
-          <w:tcPr>
-            <w:tcW w:w="3114" w:type="dxa"/>
-          </w:tcPr>
-          <w:p>
-            <w:pPr>
-              <w:spacing w:after="160" w:line="259" w:lineRule="auto"/>
-              <w:rPr>
-                <w:b/>
-                <w:bCs/>
-              </w:rPr>
-            </w:pPr>
-            <w:r>
-              <w:rPr>
-                <w:b/>
-                <w:bCs/>
-              </w:rPr>
-              <w:t>Lo que hicimos esta semana (4-6 líneas): </w:t>
-            </w:r>
-          </w:p>
-        </w:tc>
-        <w:tc>
-          <w:tcPr>
-            <w:tcW w:w="5714" w:type="dxa"/>
+        <w:tc>
+          <w:tcPr>
+            <w:tcW w:w="0" w:type="auto"/>
+            <w:vAlign w:val="center"/>
           </w:tcPr>
           <w:p/>
         </w:tc>
-      </w:tr>
-      <w:tr>
-        <w:tc>
-          <w:tcPr>
-            <w:tcW w:w="3114" w:type="dxa"/>
-          </w:tcPr>
-          <w:p>
-            <w:pPr>
-              <w:spacing w:after="160" w:line="259" w:lineRule="auto"/>
-              <w:rPr>
-                <w:b/>
-                <w:bCs/>
-              </w:rPr>
-            </w:pPr>
-            <w:r>
-              <w:rPr>
-                <w:b/>
-                <w:bCs/>
-              </w:rPr>
-              <w:t>Problemas encontrados: </w:t>
-            </w:r>
-          </w:p>
-        </w:tc>
-        <w:tc>
-          <w:tcPr>
-            <w:tcW w:w="5714" w:type="dxa"/>
+        <w:tc>
+          <w:tcPr>
+            <w:tcW w:w="0" w:type="auto"/>
+            <w:vAlign w:val="center"/>
           </w:tcPr>
           <w:p/>
         </w:tc>
-      </w:tr>
-      <w:tr>
-        <w:tc>
-          <w:tcPr>
-            <w:tcW w:w="3114" w:type="dxa"/>
-          </w:tcPr>
-          <w:p>
-            <w:pPr>
-              <w:spacing w:after="160" w:line="259" w:lineRule="auto"/>
-              <w:rPr>
-                <w:b/>
-                <w:bCs/>
-              </w:rPr>
-            </w:pPr>
-            <w:r>
-              <w:rPr>
-                <w:b/>
-                <w:bCs/>
-              </w:rPr>
-              <w:t>Cómo los resolvimos: </w:t>
-            </w:r>
-          </w:p>
-          <w:p>
-            <w:pPr>
-              <w:rPr>
-                <w:b/>
-                <w:bCs/>
-              </w:rPr>
-            </w:pPr>
-          </w:p>
-        </w:tc>
-        <w:tc>
-          <w:tcPr>
-            <w:tcW w:w="5714" w:type="dxa"/>
+        <w:tc>
+          <w:tcPr>
+            <w:tcW w:w="0" w:type="auto"/>
+            <w:vAlign w:val="center"/>
           </w:tcPr>
           <w:p/>
         </w:tc>
       </w:tr>
       <w:tr>
-        <w:tc>
-          <w:tcPr>
-            <w:tcW w:w="3114" w:type="dxa"/>
-          </w:tcPr>
-          <w:p>
-            <w:pPr>
-              <w:spacing w:after="160" w:line="259" w:lineRule="auto"/>
-              <w:rPr>
-                <w:b/>
-                <w:bCs/>
-              </w:rPr>
-            </w:pPr>
-            <w:r>
-              <w:rPr>
-                <w:b/>
-                <w:bCs/>
-              </w:rPr>
-              <w:t>Usos de IA esta semana: </w:t>
-            </w:r>
-          </w:p>
-          <w:p>
-            <w:pPr>
-              <w:rPr>
-                <w:b/>
-                <w:bCs/>
-              </w:rPr>
-            </w:pPr>
-          </w:p>
-        </w:tc>
-        <w:tc>
-          <w:tcPr>
-            <w:tcW w:w="5714" w:type="dxa"/>
+        <w:trPr>
+          <w:tblCellSpacing w:w="15" w:type="dxa"/>
+        </w:trPr>
+        <w:tc>
+          <w:tcPr>
+            <w:tcW w:w="381" w:type="dxa"/>
+            <w:vAlign w:val="center"/>
           </w:tcPr>
           <w:p/>
         </w:tc>
-      </w:tr>
-      <w:tr>
-        <w:tc>
-          <w:tcPr>
-            <w:tcW w:w="3114" w:type="dxa"/>
-          </w:tcPr>
-          <w:p>
-            <w:pPr>
-              <w:spacing w:after="160" w:line="259" w:lineRule="auto"/>
-              <w:rPr>
-                <w:b/>
-                <w:bCs/>
-              </w:rPr>
-            </w:pPr>
-            <w:r>
-              <w:rPr>
-                <w:b/>
-                <w:bCs/>
-              </w:rPr>
-              <w:t>Próximos pasos: </w:t>
-            </w:r>
-          </w:p>
-          <w:p>
-            <w:pPr>
-              <w:rPr>
-                <w:b/>
-                <w:bCs/>
-              </w:rPr>
-            </w:pPr>
-          </w:p>
-        </w:tc>
-        <w:tc>
-          <w:tcPr>
-            <w:tcW w:w="5714" w:type="dxa"/>
+        <w:tc>
+          <w:tcPr>
+            <w:tcW w:w="888" w:type="dxa"/>
+            <w:vAlign w:val="center"/>
           </w:tcPr>
           <w:p/>
         </w:tc>
-      </w:tr>
-      <w:tr>
-        <w:tc>
-          <w:tcPr>
-            <w:tcW w:w="3114" w:type="dxa"/>
-          </w:tcPr>
-          <w:p>
-            <w:pPr>
-              <w:spacing w:after="160" w:line="259" w:lineRule="auto"/>
-              <w:rPr>
-                <w:b/>
-                <w:bCs/>
-              </w:rPr>
-            </w:pPr>
-            <w:r>
-              <w:rPr>
-                <w:b/>
-                <w:bCs/>
-              </w:rPr>
-              <w:t>Firmas (ambos integrantes): </w:t>
-            </w:r>
-          </w:p>
-          <w:p>
-            <w:pPr>
-              <w:rPr>
-                <w:b/>
-                <w:bCs/>
-              </w:rPr>
-            </w:pPr>
-          </w:p>
-        </w:tc>
-        <w:tc>
-          <w:tcPr>
-            <w:tcW w:w="5714" w:type="dxa"/>
+        <w:tc>
+          <w:tcPr>
+            <w:tcW w:w="0" w:type="auto"/>
+            <w:vAlign w:val="center"/>
           </w:tcPr>
           <w:p/>
         </w:tc>
-      </w:tr>
-      <w:tr>
-        <w:tc>
-          <w:tcPr>
-            <w:tcW w:w="3114" w:type="dxa"/>
-          </w:tcPr>
-          <w:p>
-            <w:pPr>
-              <w:spacing w:after="160" w:line="259" w:lineRule="auto"/>
-              <w:rPr>
-                <w:b/>
-                <w:bCs/>
-              </w:rPr>
-            </w:pPr>
-            <w:r>
-              <w:rPr>
-                <w:b/>
-                <w:bCs/>
-              </w:rPr>
-              <w:t>Firma docente: </w:t>
-            </w:r>
-          </w:p>
-          <w:p>
-            <w:pPr>
-              <w:rPr>
-                <w:b/>
-                <w:bCs/>
-              </w:rPr>
-            </w:pPr>
-          </w:p>
-        </w:tc>
-        <w:tc>
-          <w:tcPr>
-            <w:tcW w:w="5714" w:type="dxa"/>
+        <w:tc>
+          <w:tcPr>
+            <w:tcW w:w="0" w:type="auto"/>
+            <w:vAlign w:val="center"/>
+          </w:tcPr>
+          <w:p/>
+        </w:tc>
+        <w:tc>
+          <w:tcPr>
+            <w:tcW w:w="0" w:type="auto"/>
+            <w:vAlign w:val="center"/>
+          </w:tcPr>
+          <w:p/>
+        </w:tc>
+      </w:tr>
+      <w:tr>
+        <w:trPr>
+          <w:tblCellSpacing w:w="15" w:type="dxa"/>
+        </w:trPr>
+        <w:tc>
+          <w:tcPr>
+            <w:tcW w:w="381" w:type="dxa"/>
+            <w:vAlign w:val="center"/>
+          </w:tcPr>
+          <w:p/>
+        </w:tc>
+        <w:tc>
+          <w:tcPr>
+            <w:tcW w:w="888" w:type="dxa"/>
+            <w:vAlign w:val="center"/>
+          </w:tcPr>
+          <w:p/>
+        </w:tc>
+        <w:tc>
+          <w:tcPr>
+            <w:tcW w:w="0" w:type="auto"/>
+            <w:vAlign w:val="center"/>
+          </w:tcPr>
+          <w:p/>
+        </w:tc>
+        <w:tc>
+          <w:tcPr>
+            <w:tcW w:w="0" w:type="auto"/>
+            <w:vAlign w:val="center"/>
+          </w:tcPr>
+          <w:p/>
+        </w:tc>
+        <w:tc>
+          <w:tcPr>
+            <w:tcW w:w="0" w:type="auto"/>
+            <w:vAlign w:val="center"/>
+          </w:tcPr>
+          <w:p/>
+        </w:tc>
+      </w:tr>
+      <w:tr>
+        <w:trPr>
+          <w:tblCellSpacing w:w="15" w:type="dxa"/>
+        </w:trPr>
+        <w:tc>
+          <w:tcPr>
+            <w:tcW w:w="381" w:type="dxa"/>
+            <w:vAlign w:val="center"/>
+          </w:tcPr>
+          <w:p/>
+        </w:tc>
+        <w:tc>
+          <w:tcPr>
+            <w:tcW w:w="888" w:type="dxa"/>
+            <w:vAlign w:val="center"/>
+          </w:tcPr>
+          <w:p/>
+        </w:tc>
+        <w:tc>
+          <w:tcPr>
+            <w:tcW w:w="0" w:type="auto"/>
+            <w:vAlign w:val="center"/>
+          </w:tcPr>
+          <w:p/>
+        </w:tc>
+        <w:tc>
+          <w:tcPr>
+            <w:tcW w:w="0" w:type="auto"/>
+            <w:vAlign w:val="center"/>
+          </w:tcPr>
+          <w:p/>
+        </w:tc>
+        <w:tc>
+          <w:tcPr>
+            <w:tcW w:w="0" w:type="auto"/>
+            <w:vAlign w:val="center"/>
+          </w:tcPr>
+          <w:p/>
+        </w:tc>
+      </w:tr>
+      <w:tr>
+        <w:trPr>
+          <w:tblCellSpacing w:w="15" w:type="dxa"/>
+        </w:trPr>
+        <w:tc>
+          <w:tcPr>
+            <w:tcW w:w="381" w:type="dxa"/>
+            <w:vAlign w:val="center"/>
+          </w:tcPr>
+          <w:p/>
+        </w:tc>
+        <w:tc>
+          <w:tcPr>
+            <w:tcW w:w="888" w:type="dxa"/>
+            <w:vAlign w:val="center"/>
+          </w:tcPr>
+          <w:p/>
+        </w:tc>
+        <w:tc>
+          <w:tcPr>
+            <w:tcW w:w="0" w:type="auto"/>
+            <w:vAlign w:val="center"/>
+          </w:tcPr>
+          <w:p/>
+        </w:tc>
+        <w:tc>
+          <w:tcPr>
+            <w:tcW w:w="0" w:type="auto"/>
+            <w:vAlign w:val="center"/>
+          </w:tcPr>
+          <w:p/>
+        </w:tc>
+        <w:tc>
+          <w:tcPr>
+            <w:tcW w:w="0" w:type="auto"/>
+            <w:vAlign w:val="center"/>
+          </w:tcPr>
+          <w:p/>
+        </w:tc>
+      </w:tr>
+      <w:tr>
+        <w:trPr>
+          <w:tblCellSpacing w:w="15" w:type="dxa"/>
+        </w:trPr>
+        <w:tc>
+          <w:tcPr>
+            <w:tcW w:w="381" w:type="dxa"/>
+            <w:vAlign w:val="center"/>
+          </w:tcPr>
+          <w:p/>
+        </w:tc>
+        <w:tc>
+          <w:tcPr>
+            <w:tcW w:w="888" w:type="dxa"/>
+            <w:vAlign w:val="center"/>
+          </w:tcPr>
+          <w:p/>
+        </w:tc>
+        <w:tc>
+          <w:tcPr>
+            <w:tcW w:w="0" w:type="auto"/>
+            <w:vAlign w:val="center"/>
+          </w:tcPr>
+          <w:p/>
+        </w:tc>
+        <w:tc>
+          <w:tcPr>
+            <w:tcW w:w="0" w:type="auto"/>
+            <w:vAlign w:val="center"/>
+          </w:tcPr>
+          <w:p/>
+        </w:tc>
+        <w:tc>
+          <w:tcPr>
+            <w:tcW w:w="0" w:type="auto"/>
+            <w:vAlign w:val="center"/>
           </w:tcPr>
           <w:p/>
         </w:tc>
@@ -1781,6 +3236,293 @@
     </w:sectPr>
   </w:body>
 </w:document>
+</file>
+
+<file path=word/endnotes.xml><?xml version="1.0" encoding="utf-8"?>
+<w:endnotes xmlns:wpc="http://schemas.microsoft.com/office/word/2010/wordprocessingCanvas" xmlns:cx="http://schemas.microsoft.com/office/drawing/2014/chartex" xmlns:cx1="http://schemas.microsoft.com/office/drawing/2015/9/8/chartex" xmlns:cx2="http://schemas.microsoft.com/office/drawing/2015/10/21/chartex" xmlns:cx3="http://schemas.microsoft.com/office/drawing/2016/5/9/chartex" xmlns:cx4="http://schemas.microsoft.com/office/drawing/2016/5/10/chartex" xmlns:cx5="http://schemas.microsoft.com/office/drawing/2016/5/11/chartex" xmlns:cx6="http://schemas.microsoft.com/office/drawing/2016/5/12/chartex" xmlns:cx7="http://schemas.microsoft.com/office/drawing/2016/5/13/chartex" xmlns:cx8="http://schemas.microsoft.com/office/drawing/2016/5/14/chartex" xmlns:mc="http://schemas.openxmlformats.org/markup-compatibility/2006" xmlns:aink="http://schemas.microsoft.com/office/drawing/2016/ink" xmlns:am3d="http://schemas.microsoft.com/office/drawing/2017/model3d" xmlns:o="urn:schemas-microsoft-com:office:office" xmlns:oel="http://schemas.microsoft.com/office/2019/extlst" xmlns:r="http://schemas.openxmlformats.org/officeDocument/2006/relationships" xmlns:m="http://schemas.openxmlformats.org/officeDocument/2006/math" xmlns:v="urn:schemas-microsoft-com:vml" xmlns:wp14="http://schemas.microsoft.com/office/word/2010/wordprocessingDrawing" xmlns:wp="http://schemas.openxmlformats.org/drawingml/2006/wordprocessingDrawing" xmlns:w10="urn:schemas-microsoft-com:office:word" xmlns:w="http://schemas.openxmlformats.org/wordprocessingml/2006/main" xmlns:w14="http://schemas.microsoft.com/office/word/2010/wordml" xmlns:w15="http://schemas.microsoft.com/office/word/2012/wordml" xmlns:w16cex="http://schemas.microsoft.com/office/word/2018/wordml/cex" xmlns:w16cid="http://schemas.microsoft.com/office/word/2016/wordml/cid" xmlns:w16="http://schemas.microsoft.com/office/word/2018/wordml" xmlns:w16du="http://schemas.microsoft.com/office/word/2023/wordml/word16du" xmlns:w16sdtdh="http://schemas.microsoft.com/office/word/2020/wordml/sdtdatahash" xmlns:w16sdtfl="http://schemas.microsoft.com/office/word/2024/wordml/sdtformatlock" xmlns:w16se="http://schemas.microsoft.com/office/word/2015/wordml/symex" xmlns:wpg="http://schemas.microsoft.com/office/word/2010/wordprocessingGroup" xmlns:wpi="http://schemas.microsoft.com/office/word/2010/wordprocessingInk" xmlns:wne="http://schemas.microsoft.com/office/word/2006/wordml" xmlns:wps="http://schemas.microsoft.com/office/word/2010/wordprocessingShape" mc:Ignorable="w14 w15 w16se w16cid w16 w16cex w16sdtdh w16sdtfl w16du wp14">
+  <w:endnote w:type="separator" w:id="-1">
+    <w:p>
+      <w:pPr>
+        <w:spacing w:after="0" w:line="240" w:lineRule="auto"/>
+      </w:pPr>
+      <w:r>
+        <w:separator/>
+      </w:r>
+    </w:p>
+  </w:endnote>
+  <w:endnote w:type="continuationSeparator" w:id="0">
+    <w:p>
+      <w:pPr>
+        <w:spacing w:after="0" w:line="240" w:lineRule="auto"/>
+      </w:pPr>
+      <w:r>
+        <w:continuationSeparator/>
+      </w:r>
+    </w:p>
+  </w:endnote>
+</w:endnotes>
+</file>
+
+<file path=word/footnotes.xml><?xml version="1.0" encoding="utf-8"?>
+<w:footnotes xmlns:wpc="http://schemas.microsoft.com/office/word/2010/wordprocessingCanvas" xmlns:cx="http://schemas.microsoft.com/office/drawing/2014/chartex" xmlns:cx1="http://schemas.microsoft.com/office/drawing/2015/9/8/chartex" xmlns:cx2="http://schemas.microsoft.com/office/drawing/2015/10/21/chartex" xmlns:cx3="http://schemas.microsoft.com/office/drawing/2016/5/9/chartex" xmlns:cx4="http://schemas.microsoft.com/office/drawing/2016/5/10/chartex" xmlns:cx5="http://schemas.microsoft.com/office/drawing/2016/5/11/chartex" xmlns:cx6="http://schemas.microsoft.com/office/drawing/2016/5/12/chartex" xmlns:cx7="http://schemas.microsoft.com/office/drawing/2016/5/13/chartex" xmlns:cx8="http://schemas.microsoft.com/office/drawing/2016/5/14/chartex" xmlns:mc="http://schemas.openxmlformats.org/markup-compatibility/2006" xmlns:aink="http://schemas.microsoft.com/office/drawing/2016/ink" xmlns:am3d="http://schemas.microsoft.com/office/drawing/2017/model3d" xmlns:o="urn:schemas-microsoft-com:office:office" xmlns:oel="http://schemas.microsoft.com/office/2019/extlst" xmlns:r="http://schemas.openxmlformats.org/officeDocument/2006/relationships" xmlns:m="http://schemas.openxmlformats.org/officeDocument/2006/math" xmlns:v="urn:schemas-microsoft-com:vml" xmlns:wp14="http://schemas.microsoft.com/office/word/2010/wordprocessingDrawing" xmlns:wp="http://schemas.openxmlformats.org/drawingml/2006/wordprocessingDrawing" xmlns:w10="urn:schemas-microsoft-com:office:word" xmlns:w="http://schemas.openxmlformats.org/wordprocessingml/2006/main" xmlns:w14="http://schemas.microsoft.com/office/word/2010/wordml" xmlns:w15="http://schemas.microsoft.com/office/word/2012/wordml" xmlns:w16cex="http://schemas.microsoft.com/office/word/2018/wordml/cex" xmlns:w16cid="http://schemas.microsoft.com/office/word/2016/wordml/cid" xmlns:w16="http://schemas.microsoft.com/office/word/2018/wordml" xmlns:w16du="http://schemas.microsoft.com/office/word/2023/wordml/word16du" xmlns:w16sdtdh="http://schemas.microsoft.com/office/word/2020/wordml/sdtdatahash" xmlns:w16sdtfl="http://schemas.microsoft.com/office/word/2024/wordml/sdtformatlock" xmlns:w16se="http://schemas.microsoft.com/office/word/2015/wordml/symex" xmlns:wpg="http://schemas.microsoft.com/office/word/2010/wordprocessingGroup" xmlns:wpi="http://schemas.microsoft.com/office/word/2010/wordprocessingInk" xmlns:wne="http://schemas.microsoft.com/office/word/2006/wordml" xmlns:wps="http://schemas.microsoft.com/office/word/2010/wordprocessingShape" mc:Ignorable="w14 w15 w16se w16cid w16 w16cex w16sdtdh w16sdtfl w16du wp14">
+  <w:footnote w:type="separator" w:id="-1">
+    <w:p>
+      <w:pPr>
+        <w:spacing w:after="0" w:line="240" w:lineRule="auto"/>
+      </w:pPr>
+      <w:r>
+        <w:separator/>
+      </w:r>
+    </w:p>
+  </w:footnote>
+  <w:footnote w:type="continuationSeparator" w:id="0">
+    <w:p>
+      <w:pPr>
+        <w:spacing w:after="0" w:line="240" w:lineRule="auto"/>
+      </w:pPr>
+      <w:r>
+        <w:continuationSeparator/>
+      </w:r>
+    </w:p>
+  </w:footnote>
+</w:footnotes>
+</file>
+
+<file path=word/numbering.xml><?xml version="1.0" encoding="utf-8"?>
+<w:numbering xmlns:wpc="http://schemas.microsoft.com/office/word/2010/wordprocessingCanvas" xmlns:cx="http://schemas.microsoft.com/office/drawing/2014/chartex" xmlns:cx1="http://schemas.microsoft.com/office/drawing/2015/9/8/chartex" xmlns:cx2="http://schemas.microsoft.com/office/drawing/2015/10/21/chartex" xmlns:cx3="http://schemas.microsoft.com/office/drawing/2016/5/9/chartex" xmlns:cx4="http://schemas.microsoft.com/office/drawing/2016/5/10/chartex" xmlns:cx5="http://schemas.microsoft.com/office/drawing/2016/5/11/chartex" xmlns:cx6="http://schemas.microsoft.com/office/drawing/2016/5/12/chartex" xmlns:cx7="http://schemas.microsoft.com/office/drawing/2016/5/13/chartex" xmlns:cx8="http://schemas.microsoft.com/office/drawing/2016/5/14/chartex" xmlns:mc="http://schemas.openxmlformats.org/markup-compatibility/2006" xmlns:aink="http://schemas.microsoft.com/office/drawing/2016/ink" xmlns:am3d="http://schemas.microsoft.com/office/drawing/2017/model3d" xmlns:o="urn:schemas-microsoft-com:office:office" xmlns:oel="http://schemas.microsoft.com/office/2019/extlst" xmlns:r="http://schemas.openxmlformats.org/officeDocument/2006/relationships" xmlns:m="http://schemas.openxmlformats.org/officeDocument/2006/math" xmlns:v="urn:schemas-microsoft-com:vml" xmlns:wp14="http://schemas.microsoft.com/office/word/2010/wordprocessingDrawing" xmlns:wp="http://schemas.openxmlformats.org/drawingml/2006/wordprocessingDrawing" xmlns:w10="urn:schemas-microsoft-com:office:word" xmlns:w="http://schemas.openxmlformats.org/wordprocessingml/2006/main" xmlns:w14="http://schemas.microsoft.com/office/word/2010/wordml" xmlns:w15="http://schemas.microsoft.com/office/word/2012/wordml" xmlns:w16cex="http://schemas.microsoft.com/office/word/2018/wordml/cex" xmlns:w16cid="http://schemas.microsoft.com/office/word/2016/wordml/cid" xmlns:w16="http://schemas.microsoft.com/office/word/2018/wordml" xmlns:w16du="http://schemas.microsoft.com/office/word/2023/wordml/word16du" xmlns:w16sdtdh="http://schemas.microsoft.com/office/word/2020/wordml/sdtdatahash" xmlns:w16sdtfl="http://schemas.microsoft.com/office/word/2024/wordml/sdtformatlock" xmlns:w16se="http://schemas.microsoft.com/office/word/2015/wordml/symex" xmlns:wpg="http://schemas.microsoft.com/office/word/2010/wordprocessingGroup" xmlns:wpi="http://schemas.microsoft.com/office/word/2010/wordprocessingInk" xmlns:wne="http://schemas.microsoft.com/office/word/2006/wordml" xmlns:wps="http://schemas.microsoft.com/office/word/2010/wordprocessingShape" mc:Ignorable="w14 w15 w16se w16cid w16 w16cex w16sdtdh w16sdtfl w16du wp14">
+  <w:abstractNum w:abstractNumId="0" w15:restartNumberingAfterBreak="0">
+    <w:nsid w:val="60D75C6E"/>
+    <w:multiLevelType w:val="multilevel"/>
+    <w:tmpl w:val="DB2EEE18"/>
+    <w:lvl w:ilvl="0">
+      <w:start w:val="1"/>
+      <w:numFmt w:val="decimal"/>
+      <w:lvlText w:val="%1."/>
+      <w:lvlJc w:val="left"/>
+      <w:pPr>
+        <w:tabs>
+          <w:tab w:val="num" w:pos="720"/>
+        </w:tabs>
+        <w:ind w:left="720" w:hanging="360"/>
+      </w:pPr>
+    </w:lvl>
+    <w:lvl w:ilvl="1" w:tentative="1">
+      <w:start w:val="1"/>
+      <w:numFmt w:val="decimal"/>
+      <w:lvlText w:val="%2."/>
+      <w:lvlJc w:val="left"/>
+      <w:pPr>
+        <w:tabs>
+          <w:tab w:val="num" w:pos="1440"/>
+        </w:tabs>
+        <w:ind w:left="1440" w:hanging="360"/>
+      </w:pPr>
+    </w:lvl>
+    <w:lvl w:ilvl="2" w:tentative="1">
+      <w:start w:val="1"/>
+      <w:numFmt w:val="decimal"/>
+      <w:lvlText w:val="%3."/>
+      <w:lvlJc w:val="left"/>
+      <w:pPr>
+        <w:tabs>
+          <w:tab w:val="num" w:pos="2160"/>
+        </w:tabs>
+        <w:ind w:left="2160" w:hanging="360"/>
+      </w:pPr>
+    </w:lvl>
+    <w:lvl w:ilvl="3" w:tentative="1">
+      <w:start w:val="1"/>
+      <w:numFmt w:val="decimal"/>
+      <w:lvlText w:val="%4."/>
+      <w:lvlJc w:val="left"/>
+      <w:pPr>
+        <w:tabs>
+          <w:tab w:val="num" w:pos="2880"/>
+        </w:tabs>
+        <w:ind w:left="2880" w:hanging="360"/>
+      </w:pPr>
+    </w:lvl>
+    <w:lvl w:ilvl="4" w:tentative="1">
+      <w:start w:val="1"/>
+      <w:numFmt w:val="decimal"/>
+      <w:lvlText w:val="%5."/>
+      <w:lvlJc w:val="left"/>
+      <w:pPr>
+        <w:tabs>
+          <w:tab w:val="num" w:pos="3600"/>
+        </w:tabs>
+        <w:ind w:left="3600" w:hanging="360"/>
+      </w:pPr>
+    </w:lvl>
+    <w:lvl w:ilvl="5" w:tentative="1">
+      <w:start w:val="1"/>
+      <w:numFmt w:val="decimal"/>
+      <w:lvlText w:val="%6."/>
+      <w:lvlJc w:val="left"/>
+      <w:pPr>
+        <w:tabs>
+          <w:tab w:val="num" w:pos="4320"/>
+        </w:tabs>
+        <w:ind w:left="4320" w:hanging="360"/>
+      </w:pPr>
+    </w:lvl>
+    <w:lvl w:ilvl="6" w:tentative="1">
+      <w:start w:val="1"/>
+      <w:numFmt w:val="decimal"/>
+      <w:lvlText w:val="%7."/>
+      <w:lvlJc w:val="left"/>
+      <w:pPr>
+        <w:tabs>
+          <w:tab w:val="num" w:pos="5040"/>
+        </w:tabs>
+        <w:ind w:left="5040" w:hanging="360"/>
+      </w:pPr>
+    </w:lvl>
+    <w:lvl w:ilvl="7" w:tentative="1">
+      <w:start w:val="1"/>
+      <w:numFmt w:val="decimal"/>
+      <w:lvlText w:val="%8."/>
+      <w:lvlJc w:val="left"/>
+      <w:pPr>
+        <w:tabs>
+          <w:tab w:val="num" w:pos="5760"/>
+        </w:tabs>
+        <w:ind w:left="5760" w:hanging="360"/>
+      </w:pPr>
+    </w:lvl>
+    <w:lvl w:ilvl="8" w:tentative="1">
+      <w:start w:val="1"/>
+      <w:numFmt w:val="decimal"/>
+      <w:lvlText w:val="%9."/>
+      <w:lvlJc w:val="left"/>
+      <w:pPr>
+        <w:tabs>
+          <w:tab w:val="num" w:pos="6480"/>
+        </w:tabs>
+        <w:ind w:left="6480" w:hanging="360"/>
+      </w:pPr>
+    </w:lvl>
+  </w:abstractNum>
+  <w:abstractNum w:abstractNumId="1" w15:restartNumberingAfterBreak="0">
+    <w:nsid w:val="67B026C3"/>
+    <w:multiLevelType w:val="multilevel"/>
+    <w:tmpl w:val="61AED1F0"/>
+    <w:lvl w:ilvl="0">
+      <w:start w:val="1"/>
+      <w:numFmt w:val="decimal"/>
+      <w:lvlText w:val="%1."/>
+      <w:lvlJc w:val="left"/>
+      <w:pPr>
+        <w:tabs>
+          <w:tab w:val="num" w:pos="720"/>
+        </w:tabs>
+        <w:ind w:left="720" w:hanging="360"/>
+      </w:pPr>
+    </w:lvl>
+    <w:lvl w:ilvl="1" w:tentative="1">
+      <w:start w:val="1"/>
+      <w:numFmt w:val="decimal"/>
+      <w:lvlText w:val="%2."/>
+      <w:lvlJc w:val="left"/>
+      <w:pPr>
+        <w:tabs>
+          <w:tab w:val="num" w:pos="1440"/>
+        </w:tabs>
+        <w:ind w:left="1440" w:hanging="360"/>
+      </w:pPr>
+    </w:lvl>
+    <w:lvl w:ilvl="2" w:tentative="1">
+      <w:start w:val="1"/>
+      <w:numFmt w:val="decimal"/>
+      <w:lvlText w:val="%3."/>
+      <w:lvlJc w:val="left"/>
+      <w:pPr>
+        <w:tabs>
+          <w:tab w:val="num" w:pos="2160"/>
+        </w:tabs>
+        <w:ind w:left="2160" w:hanging="360"/>
+      </w:pPr>
+    </w:lvl>
+    <w:lvl w:ilvl="3" w:tentative="1">
+      <w:start w:val="1"/>
+      <w:numFmt w:val="decimal"/>
+      <w:lvlText w:val="%4."/>
+      <w:lvlJc w:val="left"/>
+      <w:pPr>
+        <w:tabs>
+          <w:tab w:val="num" w:pos="2880"/>
+        </w:tabs>
+        <w:ind w:left="2880" w:hanging="360"/>
+      </w:pPr>
+    </w:lvl>
+    <w:lvl w:ilvl="4" w:tentative="1">
+      <w:start w:val="1"/>
+      <w:numFmt w:val="decimal"/>
+      <w:lvlText w:val="%5."/>
+      <w:lvlJc w:val="left"/>
+      <w:pPr>
+        <w:tabs>
+          <w:tab w:val="num" w:pos="3600"/>
+        </w:tabs>
+        <w:ind w:left="3600" w:hanging="360"/>
+      </w:pPr>
+    </w:lvl>
+    <w:lvl w:ilvl="5" w:tentative="1">
+      <w:start w:val="1"/>
+      <w:numFmt w:val="decimal"/>
+      <w:lvlText w:val="%6."/>
+      <w:lvlJc w:val="left"/>
+      <w:pPr>
+        <w:tabs>
+          <w:tab w:val="num" w:pos="4320"/>
+        </w:tabs>
+        <w:ind w:left="4320" w:hanging="360"/>
+      </w:pPr>
+    </w:lvl>
+    <w:lvl w:ilvl="6" w:tentative="1">
+      <w:start w:val="1"/>
+      <w:numFmt w:val="decimal"/>
+      <w:lvlText w:val="%7."/>
+      <w:lvlJc w:val="left"/>
+      <w:pPr>
+        <w:tabs>
+          <w:tab w:val="num" w:pos="5040"/>
+        </w:tabs>
+        <w:ind w:left="5040" w:hanging="360"/>
+      </w:pPr>
+    </w:lvl>
+    <w:lvl w:ilvl="7" w:tentative="1">
+      <w:start w:val="1"/>
+      <w:numFmt w:val="decimal"/>
+      <w:lvlText w:val="%8."/>
+      <w:lvlJc w:val="left"/>
+      <w:pPr>
+        <w:tabs>
+          <w:tab w:val="num" w:pos="5760"/>
+        </w:tabs>
+        <w:ind w:left="5760" w:hanging="360"/>
+      </w:pPr>
+    </w:lvl>
+    <w:lvl w:ilvl="8" w:tentative="1">
+      <w:start w:val="1"/>
+      <w:numFmt w:val="decimal"/>
+      <w:lvlText w:val="%9."/>
+      <w:lvlJc w:val="left"/>
+      <w:pPr>
+        <w:tabs>
+          <w:tab w:val="num" w:pos="6480"/>
+        </w:tabs>
+        <w:ind w:left="6480" w:hanging="360"/>
+      </w:pPr>
+    </w:lvl>
+  </w:abstractNum>
+  <w:num w:numId="1" w16cid:durableId="1716152963">
+    <w:abstractNumId w:val="0"/>
+  </w:num>
+  <w:num w:numId="2" w16cid:durableId="1283925732">
+    <w:abstractNumId w:val="1"/>
+  </w:num>
+</w:numbering>
 </file>
 
 <file path=word/styles.xml><?xml version="1.0" encoding="utf-8"?>
@@ -2718,6 +4460,50 @@
       </w:tblBorders>
     </w:tblPr>
   </w:style>
+  <w:style w:type="paragraph" w:styleId="Encabezado">
+    <w:name w:val="header"/>
+    <w:basedOn w:val="Normal"/>
+    <w:link w:val="EncabezadoCar"/>
+    <w:uiPriority w:val="99"/>
+    <w:unhideWhenUsed/>
+    <w:rsid w:val="00CC2C3D"/>
+    <w:pPr>
+      <w:tabs>
+        <w:tab w:val="center" w:pos="4419"/>
+        <w:tab w:val="right" w:pos="8838"/>
+      </w:tabs>
+      <w:spacing w:after="0" w:line="240" w:lineRule="auto"/>
+    </w:pPr>
+  </w:style>
+  <w:style w:type="character" w:customStyle="1" w:styleId="EncabezadoCar">
+    <w:name w:val="Encabezado Car"/>
+    <w:basedOn w:val="Fuentedeprrafopredeter"/>
+    <w:link w:val="Encabezado"/>
+    <w:uiPriority w:val="99"/>
+    <w:rsid w:val="00CC2C3D"/>
+  </w:style>
+  <w:style w:type="paragraph" w:styleId="Piedepgina">
+    <w:name w:val="footer"/>
+    <w:basedOn w:val="Normal"/>
+    <w:link w:val="PiedepginaCar"/>
+    <w:uiPriority w:val="99"/>
+    <w:unhideWhenUsed/>
+    <w:rsid w:val="00CC2C3D"/>
+    <w:pPr>
+      <w:tabs>
+        <w:tab w:val="center" w:pos="4419"/>
+        <w:tab w:val="right" w:pos="8838"/>
+      </w:tabs>
+      <w:spacing w:after="0" w:line="240" w:lineRule="auto"/>
+    </w:pPr>
+  </w:style>
+  <w:style w:type="character" w:customStyle="1" w:styleId="PiedepginaCar">
+    <w:name w:val="Pie de página Car"/>
+    <w:basedOn w:val="Fuentedeprrafopredeter"/>
+    <w:link w:val="Piedepgina"/>
+    <w:uiPriority w:val="99"/>
+    <w:rsid w:val="00CC2C3D"/>
+  </w:style>
 </w:styles>
 </file>
 

</xml_diff>